<commit_message>
docs: rental_availability requirements v2 (review feedback)
- Fold into rental_set (no separate module); repair is an OPTIONAL dep
  (soft model check, no crash when absent).
- Clarify repairs ARE woven into the availability figure (targeted override),
  while the native forecast engine stays un-rewritten (multi-step over-count
  handled by pop-up visibility + standard padding).
- Own-demand/no-double-count promoted to a verified requirement: the current
  add-back is negated by the cap-at-qty_available; fix + dedicated test.
- Location-driven pop-up breakdown (At Customer is a location; In Repair line
  only when repair installed).
- Tests reassessed: optional-repair, confirmed own-demand, breakdown
  consistency, and a rental_set regression guard.

Co-Authored-By: Claude Opus 4.8 <noreply@anthropic.com>
Claude-Session: https://claude.ai/code/session_015UyktmijNHjiCtQB359rzX
</commit_message>
<xml_diff>
--- a/docs/rental_availability_requirements.docx
+++ b/docs/rental_availability_requirements.docx
@@ -15,7 +15,7 @@
         <w:rPr>
           <w:i/>
         </w:rPr>
-        <w:t>Functional &amp; Technical Requirements, Goals &amp; Tests — Backend / Sales (Rental) + Inventory (v1, for approval)</w:t>
+        <w:t>Functional &amp; Technical Requirements, Goals &amp; Tests — Backend / Sales (Rental) + Inventory (v2, for approval)</w:t>
       </w:r>
     </w:p>
     <w:tbl>
@@ -66,7 +66,7 @@
               <w:rPr>
                 <w:b/>
               </w:rPr>
-              <w:t>Module (proposed)</w:t>
+              <w:t>Where it lives</w:t>
             </w:r>
           </w:p>
         </w:tc>
@@ -77,7 +77,16 @@
           <w:p>
             <w:r/>
             <w:r>
-              <w:t>rental_availability</w:t>
+              <w:t xml:space="preserve">Folded into </w:t>
+            </w:r>
+            <w:r>
+              <w:rPr>
+                <w:b/>
+              </w:rPr>
+              <w:t>rental_set</w:t>
+            </w:r>
+            <w:r>
+              <w:t xml:space="preserve"> (no new module)</w:t>
             </w:r>
           </w:p>
         </w:tc>
@@ -93,7 +102,7 @@
               <w:rPr>
                 <w:b/>
               </w:rPr>
-              <w:t>Depends on</w:t>
+              <w:t>Hard deps</w:t>
             </w:r>
           </w:p>
         </w:tc>
@@ -104,7 +113,40 @@
           <w:p>
             <w:r/>
             <w:r>
-              <w:t>sale_stock_renting (rental + stock), repair, rental_set</w:t>
+              <w:t>sale_stock_renting, sale_renting, sale_stock, stock (already in rental_set)</w:t>
+            </w:r>
+          </w:p>
+        </w:tc>
+      </w:tr>
+      <w:tr>
+        <w:tc>
+          <w:tcPr>
+            <w:tcW w:type="dxa" w:w="4320"/>
+          </w:tcPr>
+          <w:p>
+            <w:r/>
+            <w:r>
+              <w:rPr>
+                <w:b/>
+              </w:rPr>
+              <w:t>Optional dep</w:t>
+            </w:r>
+          </w:p>
+        </w:tc>
+        <w:tc>
+          <w:tcPr>
+            <w:tcW w:type="dxa" w:w="4320"/>
+          </w:tcPr>
+          <w:p>
+            <w:r/>
+            <w:r>
+              <w:rPr>
+                <w:b/>
+              </w:rPr>
+              <w:t>repair</w:t>
+            </w:r>
+            <w:r>
+              <w:t xml:space="preserve"> — used only if installed; must not crash or show when absent</w:t>
             </w:r>
           </w:p>
         </w:tc>
@@ -131,7 +173,7 @@
           <w:p>
             <w:r/>
             <w:r>
-              <w:t>Rental order line availability + its pop-up; composes with rental_set</w:t>
+              <w:t>Rental order line availability + its pop-up; set availability</w:t>
             </w:r>
           </w:p>
         </w:tc>
@@ -185,7 +227,7 @@
           <w:p>
             <w:r/>
             <w:r>
-              <w:t>Requirements — for approval; no code yet</w:t>
+              <w:t>Requirements v2 — for approval; no code yet</w:t>
             </w:r>
           </w:p>
         </w:tc>
@@ -223,126 +265,181 @@
         <w:pStyle w:val="Heading1"/>
       </w:pPr>
       <w:r>
-        <w:t>1. Purpose &amp; Business Context</w:t>
+        <w:t>0. Changes vs v1 (from review)</w:t>
       </w:r>
     </w:p>
     <w:p>
       <w:r>
-        <w:t>When a rental order line is quoted, staff need a **trustworthy "available for this</w:t>
-      </w:r>
-    </w:p>
-    <w:p>
-      <w:r>
-        <w:t>period" figure</w:t>
+        <w:t xml:space="preserve">1. </w:t>
       </w:r>
       <w:r>
         <w:rPr>
           <w:b/>
         </w:rPr>
-        <w:t xml:space="preserve"> and a way to </w:t>
-      </w:r>
-      <w:r>
-        <w:t>see where the stock actually is**. Two gaps in the</w:t>
+        <w:t>Repair is optional.</w:t>
+      </w:r>
+      <w:r>
+        <w:t xml:space="preserve"> If the `repair` module is not installed: no repair deduction,</w:t>
       </w:r>
     </w:p>
     <w:p>
       <w:r>
-        <w:t>standard behaviour cause wrong numbers and confusion:</w:t>
-      </w:r>
-    </w:p>
-    <w:p>
-      <w:r>
-        <w:t xml:space="preserve">1. </w:t>
+        <w:t xml:space="preserve">   no repair line in the pop-up, </w:t>
       </w:r>
       <w:r>
         <w:rPr>
           <w:b/>
         </w:rPr>
-        <w:t>Repairs are invisible to availability.</w:t>
-      </w:r>
-      <w:r>
-        <w:t xml:space="preserve"> A unit that is broken and sitting in a</w:t>
+        <w:t>no crash</w:t>
+      </w:r>
+      <w:r>
+        <w:t xml:space="preserve"> (soft model check).</w:t>
       </w:r>
     </w:p>
     <w:p>
       <w:r>
-        <w:t xml:space="preserve">   repair order is physically in the warehouse but </w:t>
+        <w:t xml:space="preserve">2. </w:t>
       </w:r>
       <w:r>
         <w:rPr>
           <w:b/>
         </w:rPr>
-        <w:t>not rentable</w:t>
-      </w:r>
-      <w:r>
-        <w:t xml:space="preserve"> — yet standard</w:t>
+        <w:t>"At Customer" is a location</w:t>
+      </w:r>
+      <w:r>
+        <w:t xml:space="preserve"> (the company rental location). The pop-up breakdown</w:t>
       </w:r>
     </w:p>
     <w:p>
       <w:r>
-        <w:t xml:space="preserve">   availability still counts it. Rentals get quoted against stock that cannot ship.</w:t>
-      </w:r>
-    </w:p>
-    <w:p>
-      <w:r>
-        <w:t xml:space="preserve">2. </w:t>
+        <w:t xml:space="preserve">   is therefore </w:t>
       </w:r>
       <w:r>
         <w:rPr>
           <w:b/>
         </w:rPr>
-        <w:t>The availability figure is a single opaque number.</w:t>
-      </w:r>
-      <w:r>
-        <w:t xml:space="preserve"> Staff cannot see that, say,</w:t>
+        <w:t>location-driven</w:t>
+      </w:r>
+      <w:r>
+        <w:t>, which simplifies it.</w:t>
       </w:r>
     </w:p>
     <w:p>
       <w:r>
-        <w:t xml:space="preserve">   of 10 units, 3 are at a customer, 2 are in QC (not yet put away), and 1 is in</w:t>
-      </w:r>
-    </w:p>
-    <w:p>
-      <w:r>
-        <w:t xml:space="preserve">   repair — so only 4 are truly pickable.</w:t>
-      </w:r>
-    </w:p>
-    <w:p>
-      <w:r>
-        <w:t xml:space="preserve">Separately, </w:t>
+        <w:t xml:space="preserve">3. </w:t>
       </w:r>
       <w:r>
         <w:rPr>
           <w:b/>
         </w:rPr>
-        <w:t>set availability</w:t>
-      </w:r>
-      <w:r>
-        <w:t xml:space="preserve"> (rental_set) is computed with custom own-demand and</w:t>
+        <w:t>Repairs must be woven into the availability figure.</w:t>
+      </w:r>
+      <w:r>
+        <w:t xml:space="preserve"> So we *do* extend the</w:t>
       </w:r>
     </w:p>
     <w:p>
       <w:r>
-        <w:t>competing-demand math that is fragile and has produced wrong figures. It should lean on</w:t>
+        <w:t xml:space="preserve">   availability computation (a targeted override), not just the display. The "keep</w:t>
       </w:r>
     </w:p>
     <w:p>
       <w:r>
-        <w:t xml:space="preserve">the </w:t>
+        <w:t xml:space="preserve">   native, don't rewrite" decision applies </w:t>
       </w:r>
       <w:r>
         <w:rPr>
           <w:b/>
         </w:rPr>
-        <w:t>native component availability</w:t>
-      </w:r>
-      <w:r>
-        <w:t xml:space="preserve"> (which already handles own-demand via</w:t>
+        <w:t>only</w:t>
+      </w:r>
+      <w:r>
+        <w:t xml:space="preserve"> to the multi-step over-count, not to</w:t>
       </w:r>
     </w:p>
     <w:p>
       <w:r>
-        <w:t>`ignored_soline_id`) and simply take the limiting component.</w:t>
+        <w:t xml:space="preserve">   repairs.</w:t>
+      </w:r>
+    </w:p>
+    <w:p>
+      <w:r>
+        <w:t xml:space="preserve">4. </w:t>
+      </w:r>
+      <w:r>
+        <w:rPr>
+          <w:b/>
+        </w:rPr>
+        <w:t>Own-demand / no-double-count is a first-class requirement to verify</w:t>
+      </w:r>
+      <w:r>
+        <w:t xml:space="preserve"> (see §3.3):</w:t>
+      </w:r>
+    </w:p>
+    <w:p>
+      <w:r>
+        <w:t xml:space="preserve">   the current code adds back own demand for confirmed orders but then caps at</w:t>
+      </w:r>
+    </w:p>
+    <w:p>
+      <w:r>
+        <w:t xml:space="preserve">   `qty_available`, which may negate the add-back. This must be verified and tested.</w:t>
+      </w:r>
+    </w:p>
+    <w:p>
+      <w:r>
+        <w:t xml:space="preserve">5. </w:t>
+      </w:r>
+      <w:r>
+        <w:rPr>
+          <w:b/>
+        </w:rPr>
+        <w:t>Tests reassessed</w:t>
+      </w:r>
+      <w:r>
+        <w:t xml:space="preserve"> (see §7) to match: folding into rental_set, optional repair,</w:t>
+      </w:r>
+    </w:p>
+    <w:p>
+      <w:r>
+        <w:t xml:space="preserve">   own-demand correctness, and location-based breakdown.</w:t>
+      </w:r>
+    </w:p>
+    <w:p>
+      <w:r>
+        <w:t xml:space="preserve">6. </w:t>
+      </w:r>
+      <w:r>
+        <w:rPr>
+          <w:b/>
+        </w:rPr>
+        <w:t>Decisions:</w:t>
+      </w:r>
+      <w:r>
+        <w:t xml:space="preserve"> multi-step over-count → </w:t>
+      </w:r>
+      <w:r>
+        <w:rPr>
+          <w:b/>
+        </w:rPr>
+        <w:t>keep native + show portion in pop-up (1B)</w:t>
+      </w:r>
+      <w:r>
+        <w:t>;</w:t>
+      </w:r>
+    </w:p>
+    <w:p>
+      <w:r>
+        <w:t xml:space="preserve">   placement → </w:t>
+      </w:r>
+      <w:r>
+        <w:rPr>
+          <w:b/>
+        </w:rPr>
+        <w:t>fold into rental_set</w:t>
+      </w:r>
+      <w:r>
+        <w:t>.</w:t>
       </w:r>
     </w:p>
     <w:p>
@@ -350,6 +447,119 @@
         <w:pStyle w:val="Heading1"/>
       </w:pPr>
       <w:r>
+        <w:t>1. Purpose &amp; Business Context</w:t>
+      </w:r>
+    </w:p>
+    <w:p>
+      <w:r>
+        <w:t xml:space="preserve">Rental staff need a </w:t>
+      </w:r>
+      <w:r>
+        <w:rPr>
+          <w:b/>
+        </w:rPr>
+        <w:t>trustworthy "available for this period" figure</w:t>
+      </w:r>
+      <w:r>
+        <w:t xml:space="preserve"> and a way to</w:t>
+      </w:r>
+    </w:p>
+    <w:p>
+      <w:r>
+        <w:rPr>
+          <w:b/>
+        </w:rPr>
+        <w:t>see where the stock actually is</w:t>
+      </w:r>
+      <w:r>
+        <w:t>. Two gaps cause wrong numbers and confusion:</w:t>
+      </w:r>
+    </w:p>
+    <w:p>
+      <w:r>
+        <w:t xml:space="preserve">1. </w:t>
+      </w:r>
+      <w:r>
+        <w:rPr>
+          <w:b/>
+        </w:rPr>
+        <w:t>Repairs are invisible to availability.</w:t>
+      </w:r>
+      <w:r>
+        <w:t xml:space="preserve"> A broken unit in an open repair order is</w:t>
+      </w:r>
+    </w:p>
+    <w:p>
+      <w:r>
+        <w:t xml:space="preserve">   physically present but </w:t>
+      </w:r>
+      <w:r>
+        <w:rPr>
+          <w:b/>
+        </w:rPr>
+        <w:t>not rentable</w:t>
+      </w:r>
+      <w:r>
+        <w:t xml:space="preserve"> — yet standard availability still counts it.</w:t>
+      </w:r>
+    </w:p>
+    <w:p>
+      <w:r>
+        <w:t xml:space="preserve">2. </w:t>
+      </w:r>
+      <w:r>
+        <w:rPr>
+          <w:b/>
+        </w:rPr>
+        <w:t>The figure is a single opaque number.</w:t>
+      </w:r>
+      <w:r>
+        <w:t xml:space="preserve"> Staff cannot see that (e.g.) of 10 units, 3</w:t>
+      </w:r>
+    </w:p>
+    <w:p>
+      <w:r>
+        <w:t xml:space="preserve">   are at a customer, 2 are in QC (not put away), 1 is in repair — so only 4 are pickable.</w:t>
+      </w:r>
+    </w:p>
+    <w:p>
+      <w:r>
+        <w:t xml:space="preserve">Separately, </w:t>
+      </w:r>
+      <w:r>
+        <w:rPr>
+          <w:b/>
+        </w:rPr>
+        <w:t>set availability</w:t>
+      </w:r>
+      <w:r>
+        <w:t xml:space="preserve"> (rental_set) uses custom own-demand/competing-demand</w:t>
+      </w:r>
+    </w:p>
+    <w:p>
+      <w:r>
+        <w:t xml:space="preserve">math that is fragile. It should be the </w:t>
+      </w:r>
+      <w:r>
+        <w:rPr>
+          <w:b/>
+        </w:rPr>
+        <w:t>limiting component's whole-set count</w:t>
+      </w:r>
+      <w:r>
+        <w:t>, built on</w:t>
+      </w:r>
+    </w:p>
+    <w:p>
+      <w:r>
+        <w:t>the same (now repair-aware) component availability, with own-demand handled correctly.</w:t>
+      </w:r>
+    </w:p>
+    <w:p>
+      <w:pPr>
+        <w:pStyle w:val="Heading1"/>
+      </w:pPr>
+      <w:r>
         <w:t>2. Background &amp; Root-Cause (verified in code)</w:t>
       </w:r>
     </w:p>
@@ -364,46 +574,36 @@
         <w:t>Native rental availability</w:t>
       </w:r>
       <w:r>
-        <w:t xml:space="preserve"> (`sale_stock_renting`,</w:t>
+        <w:t xml:space="preserve"> (`sale_stock_renting.sale.order.line._compute_qty_at_date`):</w:t>
       </w:r>
     </w:p>
     <w:p>
       <w:r>
-        <w:t xml:space="preserve">  `sale.order.line._compute_qty_at_date`): for a start date ≤ now it uses</w:t>
+        <w:t xml:space="preserve">  for start ≤ now uses `qty_available(from_date,to_date,warehouse_id)`; for a future</w:t>
       </w:r>
     </w:p>
     <w:p>
       <w:r>
-        <w:t xml:space="preserve">  `product.with_context(from_date, to_date, warehouse_id).qty_available`; for a future</w:t>
+        <w:t xml:space="preserve">  start uses `virtual_available`. Other rentals are subtracted via</w:t>
       </w:r>
     </w:p>
     <w:p>
       <w:r>
-        <w:t xml:space="preserve">  start it uses `virtual_available` at the first day. Other rentals are subtracted via</w:t>
+        <w:t xml:space="preserve">  `_get_unavailable_qty(..., ignored_soline_id=line.id, warehouse_id=...)`, which</w:t>
       </w:r>
     </w:p>
     <w:p>
       <w:r>
-        <w:t xml:space="preserve">  `product._get_unavailable_qty(from_date, to_date, ignored_soline_id=line.id,</w:t>
-      </w:r>
-    </w:p>
-    <w:p>
-      <w:r>
-        <w:t xml:space="preserve">  warehouse_id=...)`. </w:t>
+        <w:t xml:space="preserve">  excludes </w:t>
       </w:r>
       <w:r>
         <w:rPr>
           <w:b/>
         </w:rPr>
-        <w:t>Own demand is already excluded natively</w:t>
-      </w:r>
-      <w:r>
-        <w:t xml:space="preserve"> by</w:t>
-      </w:r>
-    </w:p>
-    <w:p>
-      <w:r>
-        <w:t xml:space="preserve">  `ignored_soline_id` — no manual add-back is needed.</w:t>
+        <w:t>this line's</w:t>
+      </w:r>
+      <w:r>
+        <w:t xml:space="preserve"> rental demand.</w:t>
       </w:r>
     </w:p>
     <w:p>
@@ -414,52 +614,64 @@
         <w:rPr>
           <w:b/>
         </w:rPr>
-        <w:t>Warehouse scoping:</w:t>
-      </w:r>
-      <w:r>
-        <w:t xml:space="preserve"> with `warehouse_id` in context, `qty_available`/</w:t>
+        <w:t>rental_set already overrides this</w:t>
+      </w:r>
+      <w:r>
+        <w:t xml:space="preserve"> with a custom forecast</w:t>
       </w:r>
     </w:p>
     <w:p>
       <w:r>
-        <w:t xml:space="preserve">  `virtual_available` are scoped to the warehouse </w:t>
+        <w:t xml:space="preserve">  (`_compute_forecast_availability`) that walks stock moves over the period and, for</w:t>
+      </w:r>
+    </w:p>
+    <w:p>
+      <w:r>
+        <w:t xml:space="preserve">  confirmed orders, </w:t>
       </w:r>
       <w:r>
         <w:rPr>
           <w:b/>
         </w:rPr>
-        <w:t>view location</w:t>
-      </w:r>
-      <w:r>
-        <w:t>, i.e. they include</w:t>
+        <w:t>adds back own outgoing demand</w:t>
+      </w:r>
+      <w:r>
+        <w:t xml:space="preserve"> — then **caps at</w:t>
       </w:r>
     </w:p>
     <w:p>
       <w:r>
-        <w:t xml:space="preserve">  </w:t>
+        <w:t xml:space="preserve">  `qty_available`** (`current_stock_original`). Because `qty_available` is already</w:t>
+      </w:r>
+    </w:p>
+    <w:p>
+      <w:r>
+        <w:t xml:space="preserve">  reduced by the order's own reservation, </w:t>
       </w:r>
       <w:r>
         <w:rPr>
           <w:b/>
         </w:rPr>
-        <w:t>Input + Quality Control + Stock</w:t>
-      </w:r>
-      <w:r>
-        <w:t xml:space="preserve"> (multi-step reception siblings). QC/Input stock is</w:t>
+        <w:t>the cap can cancel the add-back</w:t>
+      </w:r>
+      <w:r>
+        <w:t xml:space="preserve"> for</w:t>
       </w:r>
     </w:p>
     <w:p>
       <w:r>
-        <w:t xml:space="preserve">  not yet rentable, so the raw figure can </w:t>
+        <w:t xml:space="preserve">  current-start orders → confirmed orders may under-count their own availability.</w:t>
+      </w:r>
+    </w:p>
+    <w:p>
+      <w:r>
+        <w:t xml:space="preserve">  </w:t>
       </w:r>
       <w:r>
         <w:rPr>
           <w:b/>
         </w:rPr>
-        <w:t>over-count</w:t>
-      </w:r>
-      <w:r>
-        <w:t xml:space="preserve"> during multi-step reception.</w:t>
+        <w:t>This is the double-count logic to verify (§3.3).</w:t>
       </w:r>
     </w:p>
     <w:p>
@@ -470,57 +682,52 @@
         <w:rPr>
           <w:b/>
         </w:rPr>
-        <w:t>Repairs:</w:t>
-      </w:r>
-      <w:r>
-        <w:t xml:space="preserve"> `repair.order.move_id` (the stock move for the repaired product) is</w:t>
+        <w:t>Warehouse scoping:</w:t>
+      </w:r>
+      <w:r>
+        <w:t xml:space="preserve"> with `warehouse_id` context, `qty_available`/`virtual_available`</w:t>
       </w:r>
     </w:p>
     <w:p>
       <w:r>
-        <w:t xml:space="preserve">  </w:t>
+        <w:t xml:space="preserve">  cover the warehouse </w:t>
       </w:r>
       <w:r>
         <w:rPr>
           <w:b/>
         </w:rPr>
-        <w:t>only created in `action_repair_done`</w:t>
-      </w:r>
-      <w:r>
-        <w:t>. While a repair is `confirmed`/`under_repair`</w:t>
-      </w:r>
-    </w:p>
-    <w:p>
-      <w:r>
-        <w:t xml:space="preserve">  there is </w:t>
+        <w:t>view location</w:t>
+      </w:r>
+      <w:r>
+        <w:t xml:space="preserve"> = </w:t>
       </w:r>
       <w:r>
         <w:rPr>
           <w:b/>
         </w:rPr>
-        <w:t>no move</w:t>
-      </w:r>
-      <w:r>
-        <w:t xml:space="preserve">, so `_get_unavailable_qty` and the forecast </w:t>
+        <w:t>Input + Quality Control + Stock</w:t>
+      </w:r>
+      <w:r>
+        <w:t>. QC/Input</w:t>
+      </w:r>
+    </w:p>
+    <w:p>
+      <w:r>
+        <w:t xml:space="preserve">  stock is not yet rentable → the raw figure can </w:t>
       </w:r>
       <w:r>
         <w:rPr>
           <w:b/>
         </w:rPr>
-        <w:t>never deduct it</w:t>
-      </w:r>
-      <w:r>
-        <w:t>.</w:t>
+        <w:t>over-count</w:t>
+      </w:r>
+      <w:r>
+        <w:t xml:space="preserve"> during multi-step</w:t>
       </w:r>
     </w:p>
     <w:p>
       <w:r>
-        <w:t xml:space="preserve">  Fields available: `product_id`, `lot_id`, `product_qty`, `state`, `create_date`,</w:t>
-      </w:r>
-    </w:p>
-    <w:p>
-      <w:r>
-        <w:t xml:space="preserve">  `schedule_date`, `location_id`.</w:t>
+        <w:t xml:space="preserve">  reception.</w:t>
       </w:r>
     </w:p>
     <w:p>
@@ -531,20 +738,62 @@
         <w:rPr>
           <w:b/>
         </w:rPr>
-        <w:t>Set availability</w:t>
-      </w:r>
-      <w:r>
-        <w:t xml:space="preserve"> (`rental_set.sale.order.line._compute_set_availability`) collects</w:t>
+        <w:t>Repairs:</w:t>
+      </w:r>
+      <w:r>
+        <w:t xml:space="preserve"> `repair.order.move_id` is created </w:t>
+      </w:r>
+      <w:r>
+        <w:rPr>
+          <w:b/>
+        </w:rPr>
+        <w:t>only in `action_repair_done`</w:t>
+      </w:r>
+      <w:r>
+        <w:t>. While</w:t>
       </w:r>
     </w:p>
     <w:p>
       <w:r>
-        <w:t xml:space="preserve">  leaf components, then per product does manual own-demand add-back + competing-demand</w:t>
+        <w:t xml:space="preserve">  `confirmed`/`under_repair` there is </w:t>
+      </w:r>
+      <w:r>
+        <w:rPr>
+          <w:b/>
+        </w:rPr>
+        <w:t>no stock move</w:t>
+      </w:r>
+      <w:r>
+        <w:t>, so the forecast never deducts</w:t>
       </w:r>
     </w:p>
     <w:p>
       <w:r>
-        <w:t xml:space="preserve">  subtraction — the fragile logic this work replaces for the availability figure.</w:t>
+        <w:t xml:space="preserve">  it. Usable fields: `product_id`, `lot_id`, `product_qty`, `state`, `create_date`,</w:t>
+      </w:r>
+    </w:p>
+    <w:p>
+      <w:r>
+        <w:t xml:space="preserve">  `schedule_date`, `location_id`.</w:t>
+      </w:r>
+    </w:p>
+    <w:p>
+      <w:pPr>
+        <w:pStyle w:val="ListBullet"/>
+      </w:pPr>
+      <w:r>
+        <w:rPr>
+          <w:b/>
+        </w:rPr>
+        <w:t>Rental "At Customer"</w:t>
+      </w:r>
+      <w:r>
+        <w:t xml:space="preserve"> is an internal location (company rental location,</w:t>
+      </w:r>
+    </w:p>
+    <w:p>
+      <w:r>
+        <w:t xml:space="preserve">  `company.rental_loc_id`) — so it is naturally part of a location breakdown.</w:t>
       </w:r>
     </w:p>
     <w:p>
@@ -560,67 +809,7 @@
         <w:pStyle w:val="Heading2"/>
       </w:pPr>
       <w:r>
-        <w:t>3.1 The multi-step over-count (QC/Input not rentable)</w:t>
-      </w:r>
-    </w:p>
-    <w:p>
-      <w:r>
-        <w:t>**Option A — Rewrite availability to a min-over-period forecast at the usable stock</w:t>
-      </w:r>
-    </w:p>
-    <w:p>
-      <w:r>
-        <w:t>location only, crediting incoming moves with lead time.**</w:t>
-      </w:r>
-    </w:p>
-    <w:p>
-      <w:r>
-        <w:t>*Pros:* most accurate.</w:t>
-      </w:r>
-    </w:p>
-    <w:p>
-      <w:r>
-        <w:t>*Cons:* large custom re-implementation of native forecast; high maintenance; duplicates</w:t>
-      </w:r>
-    </w:p>
-    <w:p>
-      <w:r>
-        <w:t>Odoo logic that changes between versions.</w:t>
-      </w:r>
-    </w:p>
-    <w:p>
-      <w:r>
-        <w:t>**Option B — Keep native availability; make the reality *visible* in the pop-up</w:t>
-      </w:r>
-    </w:p>
-    <w:p>
-      <w:r>
-        <w:t>(per-location breakdown) and rely on standard *padding/preparation time* as the safety</w:t>
-      </w:r>
-    </w:p>
-    <w:p>
-      <w:r>
-        <w:t>buffer for the reception delay.**</w:t>
-      </w:r>
-    </w:p>
-    <w:p>
-      <w:r>
-        <w:t>*Pros:* small footprint; no fork of native forecast; padding is standard config that</w:t>
-      </w:r>
-    </w:p>
-    <w:p>
-      <w:r>
-        <w:t>already exists; staff can see and judge the Input/QC portion.</w:t>
-      </w:r>
-    </w:p>
-    <w:p>
-      <w:r>
-        <w:t>*Cons:* the headline number can still include not-yet-put-away stock (mitigated by the</w:t>
-      </w:r>
-    </w:p>
-    <w:p>
-      <w:r>
-        <w:t>breakdown + padding).</w:t>
+        <w:t>3.1 Multi-step over-count (QC/Input not rentable)</w:t>
       </w:r>
     </w:p>
     <w:p>
@@ -637,35 +826,40 @@
         <w:rPr>
           <w:b/>
         </w:rPr>
-        <w:t>Option B.</w:t>
-      </w:r>
-      <w:r>
-        <w:t xml:space="preserve"> Padding stays </w:t>
+        <w:t>keep native availability</w:t>
+      </w:r>
+      <w:r>
+        <w:t xml:space="preserve"> (do not re-implement the forecast engine) and</w:t>
+      </w:r>
+    </w:p>
+    <w:p>
+      <w:r>
+        <w:t xml:space="preserve">make the reality </w:t>
       </w:r>
       <w:r>
         <w:rPr>
           <w:b/>
         </w:rPr>
-        <w:t>standard configuration</w:t>
-      </w:r>
-      <w:r>
-        <w:t xml:space="preserve"> — we add </w:t>
-      </w:r>
+        <w:t>visible</w:t>
+      </w:r>
+      <w:r>
+        <w:t xml:space="preserve"> via the per-location breakdown in the pop-up; rely on</w:t>
+      </w:r>
+    </w:p>
+    <w:p>
       <w:r>
         <w:rPr>
           <w:b/>
         </w:rPr>
-        <w:t>no</w:t>
+        <w:t>standard padding/preparation time</w:t>
+      </w:r>
+      <w:r>
+        <w:t xml:space="preserve"> (config only, no custom padding code) as the</w:t>
       </w:r>
     </w:p>
     <w:p>
       <w:r>
-        <w:t>custom padding logic (native padding is expected to change in a future Odoo version, so</w:t>
-      </w:r>
-    </w:p>
-    <w:p>
-      <w:r>
-        <w:t>it must remain untouched).</w:t>
+        <w:t>reception buffer.</w:t>
       </w:r>
     </w:p>
     <w:p>
@@ -673,84 +867,92 @@
         <w:pStyle w:val="Heading2"/>
       </w:pPr>
       <w:r>
-        <w:t>3.2 Repairs → availability</w:t>
+        <w:t>3.2 Repairs → availability, and optional dependency</w:t>
       </w:r>
     </w:p>
     <w:p>
+      <w:pPr>
+        <w:pStyle w:val="ListBullet"/>
+      </w:pPr>
       <w:r>
         <w:rPr>
           <w:b/>
         </w:rPr>
-        <w:t>Option A — Deduct open repairs from availability over their window.</w:t>
-      </w:r>
-      <w:r>
-        <w:t xml:space="preserve"> An open repair</w:t>
+        <w:t>Extend the availability computation</w:t>
+      </w:r>
+      <w:r>
+        <w:t xml:space="preserve"> (targeted override of the rental_set forecast):</w:t>
       </w:r>
     </w:p>
     <w:p>
       <w:r>
-        <w:t>(`state not in ('done','cancel')`) for a product makes `product_qty` unavailable over</w:t>
-      </w:r>
-    </w:p>
-    <w:p>
-      <w:r>
-        <w:t>`[create_date → schedule_date (or, if overdue, until actually done)]` when that window</w:t>
-      </w:r>
-    </w:p>
-    <w:p>
-      <w:r>
-        <w:t>overlaps the rental period. The unit stays at its location; deduction is keyed by</w:t>
-      </w:r>
-    </w:p>
-    <w:p>
-      <w:r>
-        <w:t>product (and lot, for serials).</w:t>
-      </w:r>
-    </w:p>
-    <w:p>
-      <w:r>
-        <w:t>*Pros:* correct rentable figure; matches the physical truth (broken ≠ rentable).</w:t>
-      </w:r>
-    </w:p>
-    <w:p>
-      <w:r>
-        <w:t>*Cons:* a small custom availability contribution to maintain.</w:t>
-      </w:r>
-    </w:p>
-    <w:p>
+        <w:t xml:space="preserve">  after the normal figure, </w:t>
+      </w:r>
       <w:r>
         <w:rPr>
           <w:b/>
         </w:rPr>
-        <w:t>Option B — Do nothing / model repair as a stock move up-front.</w:t>
-      </w:r>
-      <w:r>
-        <w:t xml:space="preserve"> Rejected: standard</w:t>
-      </w:r>
-    </w:p>
-    <w:p>
-      <w:r>
-        <w:t>repair creates no move until done, and changing that is invasive.</w:t>
-      </w:r>
-    </w:p>
-    <w:p>
+        <w:t>subtract</w:t>
+      </w:r>
+      <w:r>
+        <w:t xml:space="preserve"> the quantity tied up in </w:t>
+      </w:r>
       <w:r>
         <w:rPr>
           <w:b/>
         </w:rPr>
-        <w:t>Decision:</w:t>
-      </w:r>
-      <w:r>
-        <w:t xml:space="preserve"> </w:t>
-      </w:r>
+        <w:t>open</w:t>
+      </w:r>
+      <w:r>
+        <w:t xml:space="preserve"> repairs</w:t>
+      </w:r>
+    </w:p>
+    <w:p>
+      <w:r>
+        <w:t xml:space="preserve">  (`state not in ('done','cancel')`) whose window `[create_date → schedule_date,</w:t>
+      </w:r>
+    </w:p>
+    <w:p>
+      <w:r>
+        <w:t xml:space="preserve">  extended to now if overdue]` overlaps the rental period. Keyed by product (and `lot_id`</w:t>
+      </w:r>
+    </w:p>
+    <w:p>
+      <w:r>
+        <w:t xml:space="preserve">  for serials). The unit stays at its location; this is a logical deduction.</w:t>
+      </w:r>
+    </w:p>
+    <w:p>
+      <w:pPr>
+        <w:pStyle w:val="ListBullet"/>
+      </w:pPr>
       <w:r>
         <w:rPr>
           <w:b/>
         </w:rPr>
-        <w:t>Option A.</w:t>
-      </w:r>
-      <w:r>
-        <w:t xml:space="preserve"> This is the one genuine availability-math change.</w:t>
+        <w:t>Optional `repair`:</w:t>
+      </w:r>
+      <w:r>
+        <w:t xml:space="preserve"> guard every repair access with a model-presence check</w:t>
+      </w:r>
+    </w:p>
+    <w:p>
+      <w:r>
+        <w:t xml:space="preserve">  (`'repair.order' in self.env`). If absent: **no deduction, no pop-up repair line, no</w:t>
+      </w:r>
+    </w:p>
+    <w:p>
+      <w:r>
+        <w:t xml:space="preserve">  crash</w:t>
+      </w:r>
+      <w:r>
+        <w:rPr>
+          <w:b/>
+        </w:rPr>
+        <w:t xml:space="preserve">. `repair` is </w:t>
+      </w:r>
+      <w:r>
+        <w:t>not** added to rental_set's hard `depends`.</w:t>
       </w:r>
     </w:p>
     <w:p>
@@ -758,17 +960,59 @@
         <w:pStyle w:val="Heading2"/>
       </w:pPr>
       <w:r>
-        <w:t>3.3 Own-demand for confirmed orders (the old "don't double-count" requirement)</w:t>
+        <w:t>3.3 Own-demand for confirmed orders (no double-count) — VERIFY</w:t>
       </w:r>
     </w:p>
     <w:p>
       <w:r>
-        <w:t>The old customization manually added back the order's own reserved qty for confirmed</w:t>
+        <w:t xml:space="preserve">The requirement </w:t>
+      </w:r>
+      <w:r>
+        <w:rPr>
+          <w:b/>
+        </w:rPr>
+        <w:t>still holds</w:t>
+      </w:r>
+      <w:r>
+        <w:t xml:space="preserve">: a confirmed order must see its </w:t>
+      </w:r>
+      <w:r>
+        <w:rPr>
+          <w:b/>
+        </w:rPr>
+        <w:t>own</w:t>
+      </w:r>
+      <w:r>
+        <w:t xml:space="preserve"> reserved units as</w:t>
       </w:r>
     </w:p>
     <w:p>
       <w:r>
-        <w:t>lines. Native already excludes own demand via `ignored_soline_id`.</w:t>
+        <w:t xml:space="preserve">available </w:t>
+      </w:r>
+      <w:r>
+        <w:rPr>
+          <w:b/>
+        </w:rPr>
+        <w:t>to itself</w:t>
+      </w:r>
+      <w:r>
+        <w:t xml:space="preserve"> (not subtracted twice). Native `ignored_soline_id` removes the</w:t>
+      </w:r>
+    </w:p>
+    <w:p>
+      <w:r>
+        <w:t>*rental-demand* layer, but the *physical* `qty_available` is still reduced by the order's</w:t>
+      </w:r>
+    </w:p>
+    <w:p>
+      <w:r>
+        <w:t>own reservation — so an add-back (or an equivalent base that ignores own reservation) is</w:t>
+      </w:r>
+    </w:p>
+    <w:p>
+      <w:r>
+        <w:t>needed for the current-start branch.</w:t>
       </w:r>
     </w:p>
     <w:p>
@@ -779,35 +1023,40 @@
         <w:t>Decision:</w:t>
       </w:r>
       <w:r>
-        <w:t xml:space="preserve"> rely on </w:t>
+        <w:t xml:space="preserve"> keep an explicit own-demand correction, but </w:t>
       </w:r>
       <w:r>
         <w:rPr>
           <w:b/>
         </w:rPr>
-        <w:t>`ignored_soline_id`</w:t>
-      </w:r>
-      <w:r>
-        <w:t>; remove manual own-demand add-back. The</w:t>
+        <w:t>fix the cap</w:t>
+      </w:r>
+      <w:r>
+        <w:t xml:space="preserve"> so the add-back</w:t>
       </w:r>
     </w:p>
     <w:p>
       <w:r>
-        <w:t xml:space="preserve">"don't double-count when confirmed" requirement </w:t>
+        <w:t>is not negated (cap at *total rentable ignoring own reservation*, not at the</w:t>
+      </w:r>
+    </w:p>
+    <w:p>
+      <w:r>
+        <w:t xml:space="preserve">already-reduced `qty_available`). Cover with a dedicated test (T-05). Do </w:t>
       </w:r>
       <w:r>
         <w:rPr>
           <w:b/>
         </w:rPr>
-        <w:t>still holds</w:t>
-      </w:r>
-      <w:r>
-        <w:t>, but is satisfied by the</w:t>
+        <w:t>not</w:t>
+      </w:r>
+      <w:r>
+        <w:t xml:space="preserve"> assume</w:t>
       </w:r>
     </w:p>
     <w:p>
       <w:r>
-        <w:t>native mechanism, not custom math.</w:t>
+        <w:t>`ignored_soline_id` alone is sufficient for confirmed current-start orders.</w:t>
       </w:r>
     </w:p>
     <w:p>
@@ -826,37 +1075,27 @@
         <w:t>Decision:</w:t>
       </w:r>
       <w:r>
-        <w:t xml:space="preserve"> set availability = `min over limiting component of</w:t>
+        <w:t xml:space="preserve"> set availability = `min over leaf components of</w:t>
       </w:r>
     </w:p>
     <w:p>
       <w:r>
-        <w:t>floor( native_component_availability / qty_per_set )`, where</w:t>
+        <w:t>floor( component_availability / cumulative_qty_per_set )`, where `component_availability`</w:t>
       </w:r>
     </w:p>
     <w:p>
       <w:r>
-        <w:t>`native_component_availability` is the component line's own</w:t>
+        <w:t>is the same repair-aware, own-demand-correct figure used for standalone lines. Remove the</w:t>
       </w:r>
     </w:p>
     <w:p>
       <w:r>
-        <w:t>`virtual_available_at_date` (which now includes the repair deduction from §3.2 and</w:t>
+        <w:t>separate manual competing-demand arithmetic where the component figure already accounts</w:t>
       </w:r>
     </w:p>
     <w:p>
       <w:r>
-        <w:t>already respects `ignored_soline_id`). Remove the manual own-demand/competing-demand</w:t>
-      </w:r>
-    </w:p>
-    <w:p>
-      <w:r>
-        <w:t>arithmetic. Non-storable components remain limitless. Nested sets are traversed to leaf</w:t>
-      </w:r>
-    </w:p>
-    <w:p>
-      <w:r>
-        <w:t>components as today.</w:t>
+        <w:t>for it. Non-storable components remain limitless; nested sets traverse to leaves.</w:t>
       </w:r>
     </w:p>
     <w:p>
@@ -864,7 +1103,7 @@
         <w:pStyle w:val="Heading2"/>
       </w:pPr>
       <w:r>
-        <w:t>3.5 Where the code lives</w:t>
+        <w:t>3.5 Placement</w:t>
       </w:r>
     </w:p>
     <w:p>
@@ -875,36 +1114,109 @@
         <w:t>Decision:</w:t>
       </w:r>
       <w:r>
-        <w:t xml:space="preserve"> a </w:t>
+        <w:t xml:space="preserve"> </w:t>
       </w:r>
       <w:r>
         <w:rPr>
           <w:b/>
         </w:rPr>
-        <w:t>new module `rental_availability`</w:t>
-      </w:r>
-      <w:r>
-        <w:t xml:space="preserve"> depending on `rental_set` +</w:t>
+        <w:t>fold into rental_set</w:t>
+      </w:r>
+      <w:r>
+        <w:t xml:space="preserve"> (no separate module). Availability, sets and the</w:t>
       </w:r>
     </w:p>
     <w:p>
       <w:r>
-        <w:t>`repair`. It (a) adds the repair deduction to native rental availability, (b) extends</w:t>
+        <w:t>pop-up already live there; one module keeps the logic coherent and avoids cross-module</w:t>
       </w:r>
     </w:p>
     <w:p>
       <w:r>
-        <w:t>the availability pop-up, and (c) overrides `rental_set`'s set-availability compute to the</w:t>
+        <w:t>override ordering.</w:t>
       </w:r>
     </w:p>
     <w:p>
-      <w:r>
-        <w:t>§3.4 formula. Keeping it separate leaves `rental_set` stable and makes the availability</w:t>
+      <w:pPr>
+        <w:pStyle w:val="Heading2"/>
+      </w:pPr>
+      <w:r>
+        <w:t>3.6 Pop-up breakdown = location-driven</w:t>
       </w:r>
     </w:p>
     <w:p>
       <w:r>
-        <w:t>concern removable/toggleable.</w:t>
+        <w:rPr>
+          <w:b/>
+        </w:rPr>
+        <w:t>Decision:</w:t>
+      </w:r>
+      <w:r>
+        <w:t xml:space="preserve"> build the breakdown from </w:t>
+      </w:r>
+      <w:r>
+        <w:rPr>
+          <w:b/>
+        </w:rPr>
+        <w:t>internal locations</w:t>
+      </w:r>
+      <w:r>
+        <w:t xml:space="preserve"> for the warehouse + period:</w:t>
+      </w:r>
+    </w:p>
+    <w:p>
+      <w:pPr>
+        <w:pStyle w:val="ListBullet"/>
+      </w:pPr>
+      <w:r>
+        <w:t>per-location on-hand (Input / Quality Control / Stock …),</w:t>
+      </w:r>
+    </w:p>
+    <w:p>
+      <w:pPr>
+        <w:pStyle w:val="ListBullet"/>
+      </w:pPr>
+      <w:r>
+        <w:rPr>
+          <w:b/>
+        </w:rPr>
+        <w:t>At Customer</w:t>
+      </w:r>
+      <w:r>
+        <w:t xml:space="preserve"> = the rental location's on-hand (rented out),</w:t>
+      </w:r>
+    </w:p>
+    <w:p>
+      <w:pPr>
+        <w:pStyle w:val="ListBullet"/>
+      </w:pPr>
+      <w:r>
+        <w:rPr>
+          <w:b/>
+        </w:rPr>
+        <w:t>In Repair</w:t>
+      </w:r>
+      <w:r>
+        <w:t xml:space="preserve"> = open-repair qty (only if `repair` installed; shown as its own line</w:t>
+      </w:r>
+    </w:p>
+    <w:p>
+      <w:r>
+        <w:t xml:space="preserve">  because the unit still sits in a physical location and would otherwise be hidden),</w:t>
+      </w:r>
+    </w:p>
+    <w:p>
+      <w:pPr>
+        <w:pStyle w:val="ListBullet"/>
+      </w:pPr>
+      <w:r>
+        <w:rPr>
+          <w:b/>
+        </w:rPr>
+        <w:t>Pickable</w:t>
+      </w:r>
+      <w:r>
+        <w:t xml:space="preserve"> = usable-stock on-hand − in-repair (the net staff can ship now).</w:t>
       </w:r>
     </w:p>
     <w:p>
@@ -926,7 +1238,12 @@
         <w:t>G1</w:t>
       </w:r>
       <w:r>
-        <w:t xml:space="preserve"> Availability excludes units in open repair over the repair window.</w:t>
+        <w:t xml:space="preserve"> Availability excludes units in open repair over the repair window — **only when</w:t>
+      </w:r>
+    </w:p>
+    <w:p>
+      <w:r>
+        <w:t xml:space="preserve">  `repair` is installed**, and never crashes when it isn't.</w:t>
       </w:r>
     </w:p>
     <w:p>
@@ -940,12 +1257,21 @@
         <w:t>G2</w:t>
       </w:r>
       <w:r>
-        <w:t xml:space="preserve"> The availability pop-up shows a clear breakdown so staff see *where* stock is</w:t>
+        <w:t xml:space="preserve"> The pop-up shows a location-driven breakdown (incl. At Customer and, if present,</w:t>
       </w:r>
     </w:p>
     <w:p>
       <w:r>
-        <w:t xml:space="preserve">  and what is pickable now.</w:t>
+        <w:t xml:space="preserve">  In Repair) and the net </w:t>
+      </w:r>
+      <w:r>
+        <w:rPr>
+          <w:b/>
+        </w:rPr>
+        <w:t>Pickable</w:t>
+      </w:r>
+      <w:r>
+        <w:t xml:space="preserve"> figure.</w:t>
       </w:r>
     </w:p>
     <w:p>
@@ -959,12 +1285,12 @@
         <w:t>G3</w:t>
       </w:r>
       <w:r>
-        <w:t xml:space="preserve"> Set availability is the limiting component's whole-set count, using native</w:t>
+        <w:t xml:space="preserve"> Set availability is the limiting component's whole-set count, built on the same</w:t>
       </w:r>
     </w:p>
     <w:p>
       <w:r>
-        <w:t xml:space="preserve">  component availability (no fragile custom own-demand math).</w:t>
+        <w:t xml:space="preserve">  component availability.</w:t>
       </w:r>
     </w:p>
     <w:p>
@@ -992,7 +1318,21 @@
         <w:t>G5</w:t>
       </w:r>
       <w:r>
-        <w:t xml:space="preserve"> No double-counting of the order's own demand (via `ignored_soline_id`).</w:t>
+        <w:t xml:space="preserve"> </w:t>
+      </w:r>
+      <w:r>
+        <w:rPr>
+          <w:b/>
+        </w:rPr>
+        <w:t>No double-count:</w:t>
+      </w:r>
+      <w:r>
+        <w:t xml:space="preserve"> a confirmed order sees its own reserved units as available</w:t>
+      </w:r>
+    </w:p>
+    <w:p>
+      <w:r>
+        <w:t xml:space="preserve">  to itself (verified, not assumed).</w:t>
       </w:r>
     </w:p>
     <w:p>
@@ -1006,7 +1346,7 @@
         <w:t>G6</w:t>
       </w:r>
       <w:r>
-        <w:t xml:space="preserve"> Small, isolated footprint; native forecast is not forked.</w:t>
+        <w:t xml:space="preserve"> Small, isolated footprint inside rental_set; native forecast engine not rewritten.</w:t>
       </w:r>
     </w:p>
     <w:p>
@@ -1022,7 +1362,7 @@
         <w:pStyle w:val="Heading2"/>
       </w:pPr>
       <w:r>
-        <w:t>5.1 Repair-aware availability (RAV-01…03)</w:t>
+        <w:t>5.1 Repair-aware availability (RAV-01…04)</w:t>
       </w:r>
     </w:p>
     <w:p>
@@ -1036,12 +1376,7 @@
         <w:t>RAV-01</w:t>
       </w:r>
       <w:r>
-        <w:t xml:space="preserve"> For a rental line, availability is reduced by the quantity of the product</w:t>
-      </w:r>
-    </w:p>
-    <w:p>
-      <w:r>
-        <w:t xml:space="preserve">  tied up in </w:t>
+        <w:t xml:space="preserve"> Availability is reduced by product qty tied up in </w:t>
       </w:r>
       <w:r>
         <w:rPr>
@@ -1050,17 +1385,12 @@
         <w:t>open</w:t>
       </w:r>
       <w:r>
-        <w:t xml:space="preserve"> repair orders (`state not in ('done','cancel')`) whose window</w:t>
+        <w:t xml:space="preserve"> repairs</w:t>
       </w:r>
     </w:p>
     <w:p>
       <w:r>
-        <w:t xml:space="preserve">  `[create_date → schedule_date, extended to now if overdue]` overlaps the rental</w:t>
-      </w:r>
-    </w:p>
-    <w:p>
-      <w:r>
-        <w:t xml:space="preserve">  period.</w:t>
+        <w:t xml:space="preserve">  (`state not in ('done','cancel')`) whose window overlaps the rental period.</w:t>
       </w:r>
     </w:p>
     <w:p>
@@ -1074,12 +1404,12 @@
         <w:t>RAV-02</w:t>
       </w:r>
       <w:r>
-        <w:t xml:space="preserve"> For serial-tracked products, a repair on a specific `lot_id` removes that</w:t>
+        <w:t xml:space="preserve"> Serial products: a repair on a `lot_id` removes that one unit; qty products:</w:t>
       </w:r>
     </w:p>
     <w:p>
       <w:r>
-        <w:t xml:space="preserve">  one unit; for qty products, `product_qty` is removed.</w:t>
+        <w:t xml:space="preserve">  remove `product_qty`.</w:t>
       </w:r>
     </w:p>
     <w:p>
@@ -1093,12 +1423,30 @@
         <w:t>RAV-03</w:t>
       </w:r>
       <w:r>
-        <w:t xml:space="preserve"> Repairs already `done`/`cancel` do not reduce availability (the unit is</w:t>
+        <w:t xml:space="preserve"> `done`/`cancel` repairs do not reduce availability.</w:t>
       </w:r>
     </w:p>
     <w:p>
-      <w:r>
-        <w:t xml:space="preserve">  either back in stock or gone via recycle/scrap).</w:t>
+      <w:pPr>
+        <w:pStyle w:val="ListBullet"/>
+      </w:pPr>
+      <w:r>
+        <w:rPr>
+          <w:b/>
+        </w:rPr>
+        <w:t>RAV-04</w:t>
+      </w:r>
+      <w:r>
+        <w:t xml:space="preserve"> If `repair` is not installed: no deduction, no repair UI, </w:t>
+      </w:r>
+      <w:r>
+        <w:rPr>
+          <w:b/>
+        </w:rPr>
+        <w:t>no error</w:t>
+      </w:r>
+      <w:r>
+        <w:t>.</w:t>
       </w:r>
     </w:p>
     <w:p>
@@ -1106,7 +1454,7 @@
         <w:pStyle w:val="Heading2"/>
       </w:pPr>
       <w:r>
-        <w:t>5.2 Availability pop-up breakdown (RAV-04…06)</w:t>
+        <w:t>5.2 Availability pop-up breakdown (RAV-05…07)</w:t>
       </w:r>
     </w:p>
     <w:p>
@@ -1117,15 +1465,47 @@
         <w:rPr>
           <w:b/>
         </w:rPr>
-        <w:t>RAV-04</w:t>
-      </w:r>
-      <w:r>
-        <w:t xml:space="preserve"> The rental line availability pop-up shows, for the picking warehouse and</w:t>
+        <w:t>RAV-05</w:t>
+      </w:r>
+      <w:r>
+        <w:t xml:space="preserve"> Show, for the picking warehouse + period: per-internal-location on-hand</w:t>
       </w:r>
     </w:p>
     <w:p>
       <w:r>
-        <w:t xml:space="preserve">  period:</w:t>
+        <w:t xml:space="preserve">  (Input / QC / Stock …), </w:t>
+      </w:r>
+      <w:r>
+        <w:rPr>
+          <w:b/>
+        </w:rPr>
+        <w:t>At Customer</w:t>
+      </w:r>
+      <w:r>
+        <w:t xml:space="preserve">, </w:t>
+      </w:r>
+      <w:r>
+        <w:rPr>
+          <w:b/>
+        </w:rPr>
+        <w:t>In Repair</w:t>
+      </w:r>
+      <w:r>
+        <w:t xml:space="preserve"> (if repair installed), and net</w:t>
+      </w:r>
+    </w:p>
+    <w:p>
+      <w:r>
+        <w:t xml:space="preserve">  </w:t>
+      </w:r>
+      <w:r>
+        <w:rPr>
+          <w:b/>
+        </w:rPr>
+        <w:t>Pickable</w:t>
+      </w:r>
+      <w:r>
+        <w:t>.</w:t>
       </w:r>
     </w:p>
     <w:p>
@@ -1136,15 +1516,10 @@
         <w:rPr>
           <w:b/>
         </w:rPr>
-        <w:t>Total on-hand</w:t>
-      </w:r>
-      <w:r>
-        <w:t xml:space="preserve"> (with a per-internal-location split, e.g. Input / Quality Control</w:t>
-      </w:r>
-    </w:p>
-    <w:p>
-      <w:r>
-        <w:t xml:space="preserve">    / Stock), so not-yet-put-away stock is visible;</w:t>
+        <w:t>RAV-06</w:t>
+      </w:r>
+      <w:r>
+        <w:t xml:space="preserve"> Repairs get an explicit line (only when repair installed).</w:t>
       </w:r>
     </w:p>
     <w:p>
@@ -1155,10 +1530,18 @@
         <w:rPr>
           <w:b/>
         </w:rPr>
-        <w:t>At Customer</w:t>
-      </w:r>
-      <w:r>
-        <w:t xml:space="preserve"> (rented out / not yet returned);</w:t>
+        <w:t>RAV-07</w:t>
+      </w:r>
+      <w:r>
+        <w:t xml:space="preserve"> Read-only; adds no blocking behaviour.</w:t>
+      </w:r>
+    </w:p>
+    <w:p>
+      <w:pPr>
+        <w:pStyle w:val="Heading2"/>
+      </w:pPr>
+      <w:r>
+        <w:t>5.3 Set availability (RAV-08…09)</w:t>
       </w:r>
     </w:p>
     <w:p>
@@ -1169,10 +1552,15 @@
         <w:rPr>
           <w:b/>
         </w:rPr>
-        <w:t>In Repair</w:t>
-      </w:r>
-      <w:r>
-        <w:t xml:space="preserve"> (open repairs, per RAV-01);</w:t>
+        <w:t>RAV-08</w:t>
+      </w:r>
+      <w:r>
+        <w:t xml:space="preserve"> Set availability = `min over leaf components of</w:t>
+      </w:r>
+    </w:p>
+    <w:p>
+      <w:r>
+        <w:t xml:space="preserve">  floor( component_availability / cumulative_qty_per_set )`.</w:t>
       </w:r>
     </w:p>
     <w:p>
@@ -1183,10 +1571,23 @@
         <w:rPr>
           <w:b/>
         </w:rPr>
-        <w:t>Pickable</w:t>
-      </w:r>
-      <w:r>
-        <w:t xml:space="preserve"> = the net figure staff can actually ship now.</w:t>
+        <w:t>RAV-09</w:t>
+      </w:r>
+      <w:r>
+        <w:t xml:space="preserve"> Non-storable components are limitless; nested sets traverse to leaves; own</w:t>
+      </w:r>
+    </w:p>
+    <w:p>
+      <w:r>
+        <w:t xml:space="preserve">  demand handled per §3.3.</w:t>
+      </w:r>
+    </w:p>
+    <w:p>
+      <w:pPr>
+        <w:pStyle w:val="Heading2"/>
+      </w:pPr>
+      <w:r>
+        <w:t>5.4 Own-demand &amp; guards (RAV-10…12)</w:t>
       </w:r>
     </w:p>
     <w:p>
@@ -1197,24 +1598,15 @@
         <w:rPr>
           <w:b/>
         </w:rPr>
-        <w:t>RAV-05</w:t>
-      </w:r>
-      <w:r>
-        <w:t xml:space="preserve"> Repairs get </w:t>
-      </w:r>
-      <w:r>
-        <w:rPr>
-          <w:b/>
-        </w:rPr>
-        <w:t>explicit attention</w:t>
-      </w:r>
-      <w:r>
-        <w:t xml:space="preserve"> in the pop-up (own line/section), since</w:t>
+        <w:t>RAV-10</w:t>
+      </w:r>
+      <w:r>
+        <w:t xml:space="preserve"> A confirmed order's own reserved units count as available to itself</w:t>
       </w:r>
     </w:p>
     <w:p>
       <w:r>
-        <w:t xml:space="preserve">  they typically remain in place and are otherwise invisible.</w:t>
+        <w:t xml:space="preserve">  (no double-count; the cap must not negate the add-back).</w:t>
       </w:r>
     </w:p>
     <w:p>
@@ -1225,18 +1617,10 @@
         <w:rPr>
           <w:b/>
         </w:rPr>
-        <w:t>RAV-06</w:t>
-      </w:r>
-      <w:r>
-        <w:t xml:space="preserve"> The pop-up remains read-only and adds no blocking behaviour.</w:t>
-      </w:r>
-    </w:p>
-    <w:p>
-      <w:pPr>
-        <w:pStyle w:val="Heading2"/>
-      </w:pPr>
-      <w:r>
-        <w:t>5.3 Set availability (RAV-07…08)</w:t>
+        <w:t>RAV-11</w:t>
+      </w:r>
+      <w:r>
+        <w:t xml:space="preserve"> Padding/preparation time is standard config; this work adds none.</w:t>
       </w:r>
     </w:p>
     <w:p>
@@ -1247,15 +1631,18 @@
         <w:rPr>
           <w:b/>
         </w:rPr>
-        <w:t>RAV-07</w:t>
-      </w:r>
-      <w:r>
-        <w:t xml:space="preserve"> For a set line, availability = `min over leaf components of</w:t>
+        <w:t>RAV-12</w:t>
+      </w:r>
+      <w:r>
+        <w:t xml:space="preserve"> Only rental orders (`is_rental_order`) and storable products are affected.</w:t>
       </w:r>
     </w:p>
     <w:p>
-      <w:r>
-        <w:t xml:space="preserve">  floor( component.virtual_available_at_date / cumulative_qty_per_set )`.</w:t>
+      <w:pPr>
+        <w:pStyle w:val="Heading1"/>
+      </w:pPr>
+      <w:r>
+        <w:t>6. Technical Approach (proposed)</w:t>
       </w:r>
     </w:p>
     <w:p>
@@ -1266,28 +1653,25 @@
         <w:rPr>
           <w:b/>
         </w:rPr>
-        <w:t>RAV-08</w:t>
-      </w:r>
-      <w:r>
-        <w:t xml:space="preserve"> Non-storable components are limitless; a set of only non-storable</w:t>
+        <w:t>Optional repair helper:</w:t>
+      </w:r>
+      <w:r>
+        <w:t xml:space="preserve"> on `product.product`, a method returning open-repair qty</w:t>
       </w:r>
     </w:p>
     <w:p>
       <w:r>
-        <w:t xml:space="preserve">  components is fully available. Nested sets traverse to leaves. Own demand is handled by</w:t>
+        <w:t xml:space="preserve">  overlapping `[from_date, to_date]` for a warehouse (and optional lot), implemented as</w:t>
       </w:r>
     </w:p>
     <w:p>
       <w:r>
-        <w:t xml:space="preserve">  `ignored_soline_id` — no manual add-back.</w:t>
+        <w:t xml:space="preserve">  `if 'repair.order' not in self.env: return 0.0` then a search on open repairs. No</w:t>
       </w:r>
     </w:p>
     <w:p>
-      <w:pPr>
-        <w:pStyle w:val="Heading2"/>
-      </w:pPr>
-      <w:r>
-        <w:t>5.4 Non-goals / guards (RAV-09…10)</w:t>
+      <w:r>
+        <w:t xml:space="preserve">  import of the repair module; pure registry check.</w:t>
       </w:r>
     </w:p>
     <w:p>
@@ -1298,19 +1682,20 @@
         <w:rPr>
           <w:b/>
         </w:rPr>
-        <w:t>RAV-09</w:t>
-      </w:r>
-      <w:r>
-        <w:t xml:space="preserve"> Padding/preparation time is </w:t>
-      </w:r>
-      <w:r>
-        <w:rPr>
-          <w:b/>
-        </w:rPr>
-        <w:t>standard config</w:t>
-      </w:r>
-      <w:r>
-        <w:t>; this module adds none.</w:t>
+        <w:t>Availability:</w:t>
+      </w:r>
+      <w:r>
+        <w:t xml:space="preserve"> extend rental_set's `_compute_forecast_availability` /</w:t>
+      </w:r>
+    </w:p>
+    <w:p>
+      <w:r>
+        <w:t xml:space="preserve">  `_compute_qty_at_date` to (a) subtract the repair helper and (b) fix the own-demand cap</w:t>
+      </w:r>
+    </w:p>
+    <w:p>
+      <w:r>
+        <w:t xml:space="preserve">  (§3.3). Standalone and component lines share this figure.</w:t>
       </w:r>
     </w:p>
     <w:p>
@@ -1321,15 +1706,34 @@
         <w:rPr>
           <w:b/>
         </w:rPr>
-        <w:t>RAV-10</w:t>
-      </w:r>
-      <w:r>
-        <w:t xml:space="preserve"> Only rental orders (`is_rental_order`) and storable products are affected;</w:t>
+        <w:t>Set availability:</w:t>
+      </w:r>
+      <w:r>
+        <w:t xml:space="preserve"> `_compute_set_availability` reads the component figure and applies</w:t>
       </w:r>
     </w:p>
     <w:p>
       <w:r>
-        <w:t xml:space="preserve">  ordinary sale lines are untouched.</w:t>
+        <w:t xml:space="preserve">  `floor(min(avail / qty_per_set))`.</w:t>
+      </w:r>
+    </w:p>
+    <w:p>
+      <w:pPr>
+        <w:pStyle w:val="ListBullet"/>
+      </w:pPr>
+      <w:r>
+        <w:rPr>
+          <w:b/>
+        </w:rPr>
+        <w:t>Pop-up:</w:t>
+      </w:r>
+      <w:r>
+        <w:t xml:space="preserve"> extend the native `qty_at_date_widget` (OWL) + server data with the</w:t>
+      </w:r>
+    </w:p>
+    <w:p>
+      <w:r>
+        <w:t xml:space="preserve">  location-driven breakdown; repair line rendered only when repair is installed.</w:t>
       </w:r>
     </w:p>
     <w:p>
@@ -1337,97 +1741,7 @@
         <w:pStyle w:val="Heading1"/>
       </w:pPr>
       <w:r>
-        <w:t>6. Technical Approach (proposed)</w:t>
-      </w:r>
-    </w:p>
-    <w:p>
-      <w:pPr>
-        <w:pStyle w:val="ListBullet"/>
-      </w:pPr>
-      <w:r>
-        <w:rPr>
-          <w:b/>
-        </w:rPr>
-        <w:t>Repair contribution:</w:t>
-      </w:r>
-      <w:r>
-        <w:t xml:space="preserve"> a helper (e.g. `product.product._get_repair_unavailable_qty(</w:t>
-      </w:r>
-    </w:p>
-    <w:p>
-      <w:r>
-        <w:t xml:space="preserve">  from_date, to_date, warehouse_id, lot_id=…)`) summing open-repair `product_qty` whose</w:t>
-      </w:r>
-    </w:p>
-    <w:p>
-      <w:r>
-        <w:t xml:space="preserve">  window overlaps `[from_date, to_date]`. Subtract it in an override of</w:t>
-      </w:r>
-    </w:p>
-    <w:p>
-      <w:r>
-        <w:t xml:space="preserve">  `sale.order.line._compute_qty_at_date` (after `super()`), lowering</w:t>
-      </w:r>
-    </w:p>
-    <w:p>
-      <w:r>
-        <w:t xml:space="preserve">  `virtual_available_at_date`/`free_qty_today`.</w:t>
-      </w:r>
-    </w:p>
-    <w:p>
-      <w:pPr>
-        <w:pStyle w:val="ListBullet"/>
-      </w:pPr>
-      <w:r>
-        <w:rPr>
-          <w:b/>
-        </w:rPr>
-        <w:t>Pop-up:</w:t>
-      </w:r>
-      <w:r>
-        <w:t xml:space="preserve"> extend the native `qty_at_date_widget` (OWL) template + its data source</w:t>
-      </w:r>
-    </w:p>
-    <w:p>
-      <w:r>
-        <w:t xml:space="preserve">  (add breakdown fields computed server-side: on-hand per internal location, at-customer,</w:t>
-      </w:r>
-    </w:p>
-    <w:p>
-      <w:r>
-        <w:t xml:space="preserve">  in-repair, pickable). Purely presentational.</w:t>
-      </w:r>
-    </w:p>
-    <w:p>
-      <w:pPr>
-        <w:pStyle w:val="ListBullet"/>
-      </w:pPr>
-      <w:r>
-        <w:rPr>
-          <w:b/>
-        </w:rPr>
-        <w:t>Set availability:</w:t>
-      </w:r>
-      <w:r>
-        <w:t xml:space="preserve"> override `rental_set._compute_set_availability` to the §3.4</w:t>
-      </w:r>
-    </w:p>
-    <w:p>
-      <w:r>
-        <w:t xml:space="preserve">  formula, reading each leaf's `virtual_available_at_date` (repair-aware) instead of the</w:t>
-      </w:r>
-    </w:p>
-    <w:p>
-      <w:r>
-        <w:t xml:space="preserve">  manual math.</w:t>
-      </w:r>
-    </w:p>
-    <w:p>
-      <w:pPr>
-        <w:pStyle w:val="Heading1"/>
-      </w:pPr>
-      <w:r>
-        <w:t>7. Tests (proposed `tests/test_rental_availability.py`)</w:t>
+        <w:t>7. Tests (reassessed — `rental_set/tests/test_rental_availability.py`)</w:t>
       </w:r>
     </w:p>
     <w:tbl>
@@ -1518,7 +1832,7 @@
           <w:p>
             <w:r/>
             <w:r>
-              <w:t>an open repair over the period lowers the line's availability by product_qty</w:t>
+              <w:t>open repair over the period lowers availability by product_qty</w:t>
             </w:r>
           </w:p>
         </w:tc>
@@ -1610,7 +1924,7 @@
           <w:p>
             <w:r/>
             <w:r>
-              <w:t>a repair whose window doesn't overlap the rental period has no effect</w:t>
+              <w:t>repair window not overlapping the period → no effect</w:t>
             </w:r>
           </w:p>
         </w:tc>
@@ -1656,7 +1970,7 @@
           <w:p>
             <w:r/>
             <w:r>
-              <w:t>a repair on a serial removes exactly that unit</w:t>
+              <w:t>repair on a serial removes exactly that unit</w:t>
             </w:r>
           </w:p>
         </w:tc>
@@ -1691,7 +2005,7 @@
           <w:p>
             <w:r/>
             <w:r>
-              <w:t>test_set_availability_limiting_component</w:t>
+              <w:t>test_confirmed_own_demand_not_double_counted</w:t>
             </w:r>
           </w:p>
         </w:tc>
@@ -1702,7 +2016,7 @@
           <w:p>
             <w:r/>
             <w:r>
-              <w:t>set availability = floor(min component avail / qty-per-set)</w:t>
+              <w:t>confirmed order sees its own reserved units as available (add-back not negated by the cap)</w:t>
             </w:r>
           </w:p>
         </w:tc>
@@ -1713,7 +2027,7 @@
           <w:p>
             <w:r/>
             <w:r>
-              <w:t>RAV-07</w:t>
+              <w:t>RAV-10, G5</w:t>
             </w:r>
           </w:p>
         </w:tc>
@@ -1737,7 +2051,7 @@
           <w:p>
             <w:r/>
             <w:r>
-              <w:t>test_set_non_storable_limitless</w:t>
+              <w:t>test_set_availability_limiting_component</w:t>
             </w:r>
           </w:p>
         </w:tc>
@@ -1748,7 +2062,7 @@
           <w:p>
             <w:r/>
             <w:r>
-              <w:t>non-storable components don't constrain the set</w:t>
+              <w:t>set avail = floor(min component avail / qty-per-set)</w:t>
             </w:r>
           </w:p>
         </w:tc>
@@ -1783,7 +2097,7 @@
           <w:p>
             <w:r/>
             <w:r>
-              <w:t>test_own_demand_not_double_counted</w:t>
+              <w:t>test_set_non_storable_limitless</w:t>
             </w:r>
           </w:p>
         </w:tc>
@@ -1794,7 +2108,7 @@
           <w:p>
             <w:r/>
             <w:r>
-              <w:t>a confirmed order's own demand doesn't reduce its own availability (ignored_soline_id)</w:t>
+              <w:t>non-storable components don't constrain the set</w:t>
             </w:r>
           </w:p>
         </w:tc>
@@ -1805,7 +2119,7 @@
           <w:p>
             <w:r/>
             <w:r>
-              <w:t>RAV-05/G5</w:t>
+              <w:t>RAV-09</w:t>
             </w:r>
           </w:p>
         </w:tc>
@@ -1829,7 +2143,7 @@
           <w:p>
             <w:r/>
             <w:r>
-              <w:t>test_breakdown_values</w:t>
+              <w:t>test_breakdown_is_location_consistent</w:t>
             </w:r>
           </w:p>
         </w:tc>
@@ -1840,7 +2154,53 @@
           <w:p>
             <w:r/>
             <w:r>
-              <w:t>pop-up breakdown numbers sum consistently (total − at-customer − in-repair ≈ pickable)</w:t>
+              <w:t>breakdown: Σ per-location on-hand and Pickable = usable on-hand − in-repair</w:t>
+            </w:r>
+          </w:p>
+        </w:tc>
+        <w:tc>
+          <w:tcPr>
+            <w:tcW w:type="dxa" w:w="2160"/>
+          </w:tcPr>
+          <w:p>
+            <w:r/>
+            <w:r>
+              <w:t>RAV-05</w:t>
+            </w:r>
+          </w:p>
+        </w:tc>
+      </w:tr>
+      <w:tr>
+        <w:tc>
+          <w:tcPr>
+            <w:tcW w:type="dxa" w:w="2160"/>
+          </w:tcPr>
+          <w:p>
+            <w:r/>
+            <w:r>
+              <w:t>T-09</w:t>
+            </w:r>
+          </w:p>
+        </w:tc>
+        <w:tc>
+          <w:tcPr>
+            <w:tcW w:type="dxa" w:w="2160"/>
+          </w:tcPr>
+          <w:p>
+            <w:r/>
+            <w:r>
+              <w:t>test_repair_not_installed_no_crash</w:t>
+            </w:r>
+          </w:p>
+        </w:tc>
+        <w:tc>
+          <w:tcPr>
+            <w:tcW w:type="dxa" w:w="2160"/>
+          </w:tcPr>
+          <w:p>
+            <w:r/>
+            <w:r>
+              <w:t>with repair absent (simulated), availability computes and no repair UI/deduction</w:t>
             </w:r>
           </w:p>
         </w:tc>
@@ -1864,7 +2224,7 @@
           <w:p>
             <w:r/>
             <w:r>
-              <w:t>T-09</w:t>
+              <w:t>T-10</w:t>
             </w:r>
           </w:p>
         </w:tc>
@@ -1886,7 +2246,7 @@
           <w:p>
             <w:r/>
             <w:r>
-              <w:t>a non-rental sale line's availability is unchanged</w:t>
+              <w:t>non-rental sale line availability unchanged</w:t>
             </w:r>
           </w:p>
         </w:tc>
@@ -1897,13 +2257,83 @@
           <w:p>
             <w:r/>
             <w:r>
-              <w:t>RAV-10</w:t>
+              <w:t>RAV-12</w:t>
+            </w:r>
+          </w:p>
+        </w:tc>
+      </w:tr>
+      <w:tr>
+        <w:tc>
+          <w:tcPr>
+            <w:tcW w:type="dxa" w:w="2160"/>
+          </w:tcPr>
+          <w:p>
+            <w:r/>
+            <w:r>
+              <w:t>T-11</w:t>
+            </w:r>
+          </w:p>
+        </w:tc>
+        <w:tc>
+          <w:tcPr>
+            <w:tcW w:type="dxa" w:w="2160"/>
+          </w:tcPr>
+          <w:p>
+            <w:r/>
+            <w:r>
+              <w:t>test_existing_set_availability_regression</w:t>
+            </w:r>
+          </w:p>
+        </w:tc>
+        <w:tc>
+          <w:tcPr>
+            <w:tcW w:type="dxa" w:w="2160"/>
+          </w:tcPr>
+          <w:p>
+            <w:r/>
+            <w:r>
+              <w:t>prior rental_set set-availability tests still pass (no regression)</w:t>
+            </w:r>
+          </w:p>
+        </w:tc>
+        <w:tc>
+          <w:tcPr>
+            <w:tcW w:type="dxa" w:w="2160"/>
+          </w:tcPr>
+          <w:p>
+            <w:r/>
+            <w:r>
+              <w:t>G3</w:t>
             </w:r>
           </w:p>
         </w:tc>
       </w:tr>
     </w:tbl>
     <w:p>
+      <w:r>
+        <w:t xml:space="preserve">*Note:* existing rental_set availability tests will be </w:t>
+      </w:r>
+      <w:r>
+        <w:rPr>
+          <w:b/>
+        </w:rPr>
+        <w:t>re-run and adjusted</w:t>
+      </w:r>
+      <w:r>
+        <w:t xml:space="preserve"> where the</w:t>
+      </w:r>
+    </w:p>
+    <w:p>
+      <w:r>
+        <w:t>figure legitimately changes (repair deduction, cap fix); any that encoded the old capped</w:t>
+      </w:r>
+    </w:p>
+    <w:p>
+      <w:r>
+        <w:t>behaviour will be updated to the corrected expectation, documented in the commit.</w:t>
+      </w:r>
+    </w:p>
+    <w:p>
       <w:pPr>
         <w:pStyle w:val="Heading1"/>
       </w:pPr>
@@ -1916,7 +2346,7 @@
         <w:pStyle w:val="ListBullet"/>
       </w:pPr>
       <w:r>
-        <w:t>Rewriting the native forecast to a usable-location min-over-period engine (§3.1 Opt A).</w:t>
+        <w:t>Rewriting the native forecast to a usable-location min-over-period engine (kept native).</w:t>
       </w:r>
     </w:p>
     <w:p>
@@ -1924,7 +2354,7 @@
         <w:pStyle w:val="ListBullet"/>
       </w:pPr>
       <w:r>
-        <w:t>Any change to native padding/preparation-time logic (§3.1, RAV-09).</w:t>
+        <w:t>Any change to native padding/preparation-time logic.</w:t>
       </w:r>
     </w:p>
     <w:p>
@@ -1932,12 +2362,12 @@
         <w:pStyle w:val="ListBullet"/>
       </w:pPr>
       <w:r>
-        <w:t>Cleaning/QC as an explicit rentability gate beyond the pop-up's visibility (handled by</w:t>
+        <w:t>Cleaning/QC as an explicit rentability gate beyond pop-up visibility (a return-route</w:t>
       </w:r>
     </w:p>
     <w:p>
       <w:r>
-        <w:t xml:space="preserve">  a location step in the return route, tracked separately).</w:t>
+        <w:t xml:space="preserve">  location step, tracked separately).</w:t>
       </w:r>
     </w:p>
     <w:sectPr>

</xml_diff>

<commit_message>
docs: rental_availability requirements v3 (explicit reservation split)
Adopt the agreed solution for own-demand transparency: the availability
pop-up shows 'Reserved by this order' and 'Reserved by other orders' as
explicit lines, so the availability number is self-explanatory and auditable
instead of relying on hidden add-back/cap math. Adds RAV-13 and test T-12.

Co-Authored-By: Claude Opus 4.8 <noreply@anthropic.com>
Claude-Session: https://claude.ai/code/session_015UyktmijNHjiCtQB359rzX
</commit_message>
<xml_diff>
--- a/docs/rental_availability_requirements.docx
+++ b/docs/rental_availability_requirements.docx
@@ -15,7 +15,7 @@
         <w:rPr>
           <w:i/>
         </w:rPr>
-        <w:t>Functional &amp; Technical Requirements, Goals &amp; Tests — Backend / Sales (Rental) + Inventory (v2, for approval)</w:t>
+        <w:t>Functional &amp; Technical Requirements, Goals &amp; Tests — Backend / Sales (Rental) + Inventory (v3, for approval)</w:t>
       </w:r>
     </w:p>
     <w:tbl>
@@ -443,116 +443,55 @@
       </w:r>
     </w:p>
     <w:p>
-      <w:pPr>
-        <w:pStyle w:val="Heading1"/>
-      </w:pPr>
-      <w:r>
-        <w:t>1. Purpose &amp; Business Context</w:t>
-      </w:r>
-    </w:p>
-    <w:p>
-      <w:r>
-        <w:t xml:space="preserve">Rental staff need a </w:t>
+      <w:r>
+        <w:t xml:space="preserve">7. </w:t>
       </w:r>
       <w:r>
         <w:rPr>
           <w:b/>
         </w:rPr>
-        <w:t>trustworthy "available for this period" figure</w:t>
-      </w:r>
-      <w:r>
-        <w:t xml:space="preserve"> and a way to</w:t>
+        <w:t>Reservation split is shown explicitly (v3).</w:t>
+      </w:r>
+      <w:r>
+        <w:t xml:space="preserve"> Rather than hide the own-demand</w:t>
       </w:r>
     </w:p>
     <w:p>
+      <w:r>
+        <w:t xml:space="preserve">   correction inside add-back/cap math, the pop-up shows </w:t>
+      </w:r>
       <w:r>
         <w:rPr>
           <w:b/>
         </w:rPr>
-        <w:t>see where the stock actually is</w:t>
-      </w:r>
-      <w:r>
-        <w:t>. Two gaps cause wrong numbers and confusion:</w:t>
+        <w:t>Reserved by this order</w:t>
+      </w:r>
+      <w:r>
+        <w:t xml:space="preserve"> and</w:t>
       </w:r>
     </w:p>
     <w:p>
       <w:r>
-        <w:t xml:space="preserve">1. </w:t>
+        <w:t xml:space="preserve">   </w:t>
       </w:r>
       <w:r>
         <w:rPr>
           <w:b/>
         </w:rPr>
-        <w:t>Repairs are invisible to availability.</w:t>
-      </w:r>
-      <w:r>
-        <w:t xml:space="preserve"> A broken unit in an open repair order is</w:t>
+        <w:t>Reserved by other orders</w:t>
+      </w:r>
+      <w:r>
+        <w:t xml:space="preserve"> as their own lines. The availability number then becomes</w:t>
       </w:r>
     </w:p>
     <w:p>
       <w:r>
-        <w:t xml:space="preserve">   physically present but </w:t>
-      </w:r>
-      <w:r>
-        <w:rPr>
-          <w:b/>
-        </w:rPr>
-        <w:t>not rentable</w:t>
-      </w:r>
-      <w:r>
-        <w:t xml:space="preserve"> — yet standard availability still counts it.</w:t>
+        <w:t xml:space="preserve">   self-explanatory and auditable — you can *see* that this order's own reservation is</w:t>
       </w:r>
     </w:p>
     <w:p>
       <w:r>
-        <w:t xml:space="preserve">2. </w:t>
-      </w:r>
-      <w:r>
-        <w:rPr>
-          <w:b/>
-        </w:rPr>
-        <w:t>The figure is a single opaque number.</w:t>
-      </w:r>
-      <w:r>
-        <w:t xml:space="preserve"> Staff cannot see that (e.g.) of 10 units, 3</w:t>
-      </w:r>
-    </w:p>
-    <w:p>
-      <w:r>
-        <w:t xml:space="preserve">   are at a customer, 2 are in QC (not put away), 1 is in repair — so only 4 are pickable.</w:t>
-      </w:r>
-    </w:p>
-    <w:p>
-      <w:r>
-        <w:t xml:space="preserve">Separately, </w:t>
-      </w:r>
-      <w:r>
-        <w:rPr>
-          <w:b/>
-        </w:rPr>
-        <w:t>set availability</w:t>
-      </w:r>
-      <w:r>
-        <w:t xml:space="preserve"> (rental_set) uses custom own-demand/competing-demand</w:t>
-      </w:r>
-    </w:p>
-    <w:p>
-      <w:r>
-        <w:t xml:space="preserve">math that is fragile. It should be the </w:t>
-      </w:r>
-      <w:r>
-        <w:rPr>
-          <w:b/>
-        </w:rPr>
-        <w:t>limiting component's whole-set count</w:t>
-      </w:r>
-      <w:r>
-        <w:t>, built on</w:t>
-      </w:r>
-    </w:p>
-    <w:p>
-      <w:r>
-        <w:t>the same (now repair-aware) component availability, with own-demand handled correctly.</w:t>
+        <w:t xml:space="preserve">   counted as available to itself.</w:t>
       </w:r>
     </w:p>
     <w:p>
@@ -560,6 +499,119 @@
         <w:pStyle w:val="Heading1"/>
       </w:pPr>
       <w:r>
+        <w:t>1. Purpose &amp; Business Context</w:t>
+      </w:r>
+    </w:p>
+    <w:p>
+      <w:r>
+        <w:t xml:space="preserve">Rental staff need a </w:t>
+      </w:r>
+      <w:r>
+        <w:rPr>
+          <w:b/>
+        </w:rPr>
+        <w:t>trustworthy "available for this period" figure</w:t>
+      </w:r>
+      <w:r>
+        <w:t xml:space="preserve"> and a way to</w:t>
+      </w:r>
+    </w:p>
+    <w:p>
+      <w:r>
+        <w:rPr>
+          <w:b/>
+        </w:rPr>
+        <w:t>see where the stock actually is</w:t>
+      </w:r>
+      <w:r>
+        <w:t>. Two gaps cause wrong numbers and confusion:</w:t>
+      </w:r>
+    </w:p>
+    <w:p>
+      <w:r>
+        <w:t xml:space="preserve">1. </w:t>
+      </w:r>
+      <w:r>
+        <w:rPr>
+          <w:b/>
+        </w:rPr>
+        <w:t>Repairs are invisible to availability.</w:t>
+      </w:r>
+      <w:r>
+        <w:t xml:space="preserve"> A broken unit in an open repair order is</w:t>
+      </w:r>
+    </w:p>
+    <w:p>
+      <w:r>
+        <w:t xml:space="preserve">   physically present but </w:t>
+      </w:r>
+      <w:r>
+        <w:rPr>
+          <w:b/>
+        </w:rPr>
+        <w:t>not rentable</w:t>
+      </w:r>
+      <w:r>
+        <w:t xml:space="preserve"> — yet standard availability still counts it.</w:t>
+      </w:r>
+    </w:p>
+    <w:p>
+      <w:r>
+        <w:t xml:space="preserve">2. </w:t>
+      </w:r>
+      <w:r>
+        <w:rPr>
+          <w:b/>
+        </w:rPr>
+        <w:t>The figure is a single opaque number.</w:t>
+      </w:r>
+      <w:r>
+        <w:t xml:space="preserve"> Staff cannot see that (e.g.) of 10 units, 3</w:t>
+      </w:r>
+    </w:p>
+    <w:p>
+      <w:r>
+        <w:t xml:space="preserve">   are at a customer, 2 are in QC (not put away), 1 is in repair — so only 4 are pickable.</w:t>
+      </w:r>
+    </w:p>
+    <w:p>
+      <w:r>
+        <w:t xml:space="preserve">Separately, </w:t>
+      </w:r>
+      <w:r>
+        <w:rPr>
+          <w:b/>
+        </w:rPr>
+        <w:t>set availability</w:t>
+      </w:r>
+      <w:r>
+        <w:t xml:space="preserve"> (rental_set) uses custom own-demand/competing-demand</w:t>
+      </w:r>
+    </w:p>
+    <w:p>
+      <w:r>
+        <w:t xml:space="preserve">math that is fragile. It should be the </w:t>
+      </w:r>
+      <w:r>
+        <w:rPr>
+          <w:b/>
+        </w:rPr>
+        <w:t>limiting component's whole-set count</w:t>
+      </w:r>
+      <w:r>
+        <w:t>, built on</w:t>
+      </w:r>
+    </w:p>
+    <w:p>
+      <w:r>
+        <w:t>the same (now repair-aware) component availability, with own-demand handled correctly.</w:t>
+      </w:r>
+    </w:p>
+    <w:p>
+      <w:pPr>
+        <w:pStyle w:val="Heading1"/>
+      </w:pPr>
+      <w:r>
         <w:t>2. Background &amp; Root-Cause (verified in code)</w:t>
       </w:r>
     </w:p>
@@ -960,7 +1012,7 @@
         <w:pStyle w:val="Heading2"/>
       </w:pPr>
       <w:r>
-        <w:t>3.3 Own-demand for confirmed orders (no double-count) — VERIFY</w:t>
+        <w:t>3.3 Own-demand for confirmed orders (no double-count) — SHOW IT, don't hide it</w:t>
       </w:r>
     </w:p>
     <w:p>
@@ -997,22 +1049,12 @@
         <w:t>to itself</w:t>
       </w:r>
       <w:r>
-        <w:t xml:space="preserve"> (not subtracted twice). Native `ignored_soline_id` removes the</w:t>
+        <w:t xml:space="preserve"> (not subtracted twice). Today's code tries to solve this with a</w:t>
       </w:r>
     </w:p>
     <w:p>
       <w:r>
-        <w:t>*rental-demand* layer, but the *physical* `qty_available` is still reduced by the order's</w:t>
-      </w:r>
-    </w:p>
-    <w:p>
-      <w:r>
-        <w:t>own reservation — so an add-back (or an equivalent base that ignores own reservation) is</w:t>
-      </w:r>
-    </w:p>
-    <w:p>
-      <w:r>
-        <w:t>needed for the current-start branch.</w:t>
+        <w:t>hidden add-back that is then negated by a cap at `qty_available` — opaque and buggy.</w:t>
       </w:r>
     </w:p>
     <w:p>
@@ -1020,29 +1062,63 @@
         <w:rPr>
           <w:b/>
         </w:rPr>
-        <w:t>Decision:</w:t>
-      </w:r>
-      <w:r>
-        <w:t xml:space="preserve"> keep an explicit own-demand correction, but </w:t>
+        <w:t>Decision (the agreed solution):</w:t>
+      </w:r>
+      <w:r>
+        <w:t xml:space="preserve"> make the reservation split </w:t>
       </w:r>
       <w:r>
         <w:rPr>
           <w:b/>
         </w:rPr>
-        <w:t>fix the cap</w:t>
-      </w:r>
-      <w:r>
-        <w:t xml:space="preserve"> so the add-back</w:t>
+        <w:t>explicit in the pop-up</w:t>
       </w:r>
     </w:p>
     <w:p>
       <w:r>
-        <w:t>is not negated (cap at *total rentable ignoring own reservation*, not at the</w:t>
+        <w:t>rather than hide a correction. The pop-up shows:</w:t>
       </w:r>
     </w:p>
     <w:p>
-      <w:r>
-        <w:t xml:space="preserve">already-reduced `qty_available`). Cover with a dedicated test (T-05). Do </w:t>
+      <w:pPr>
+        <w:pStyle w:val="ListBullet"/>
+      </w:pPr>
+      <w:r>
+        <w:rPr>
+          <w:b/>
+        </w:rPr>
+        <w:t>Reserved by this order</w:t>
+      </w:r>
+      <w:r>
+        <w:t xml:space="preserve"> — quantity this order has already reserved (its own pickup</w:t>
+      </w:r>
+    </w:p>
+    <w:p>
+      <w:r>
+        <w:t xml:space="preserve">  moves), which </w:t>
+      </w:r>
+      <w:r>
+        <w:rPr>
+          <w:b/>
+        </w:rPr>
+        <w:t>counts as available to this order</w:t>
+      </w:r>
+      <w:r>
+        <w:t>;</w:t>
+      </w:r>
+    </w:p>
+    <w:p>
+      <w:pPr>
+        <w:pStyle w:val="ListBullet"/>
+      </w:pPr>
+      <w:r>
+        <w:rPr>
+          <w:b/>
+        </w:rPr>
+        <w:t>Reserved by other orders</w:t>
+      </w:r>
+      <w:r>
+        <w:t xml:space="preserve"> — quantity reserved by *other* orders, which is </w:t>
       </w:r>
       <w:r>
         <w:rPr>
@@ -1050,13 +1126,30 @@
         </w:rPr>
         <w:t>not</w:t>
       </w:r>
-      <w:r>
-        <w:t xml:space="preserve"> assume</w:t>
-      </w:r>
     </w:p>
     <w:p>
       <w:r>
-        <w:t>`ignored_soline_id` alone is sufficient for confirmed current-start orders.</w:t>
+        <w:t xml:space="preserve">  available to this order.</w:t>
+      </w:r>
+    </w:p>
+    <w:p>
+      <w:r>
+        <w:t>The headline availability number is then defined transparently and *verifiably* from</w:t>
+      </w:r>
+    </w:p>
+    <w:p>
+      <w:r>
+        <w:t>those lines, so the double-count question is answered by inspection. The underlying figure</w:t>
+      </w:r>
+    </w:p>
+    <w:p>
+      <w:r>
+        <w:t>still counts this order's own reservation as available to itself; the pop-up now proves it.</w:t>
+      </w:r>
+    </w:p>
+    <w:p>
+      <w:r>
+        <w:t>Covered by tests T-05 (number correct) and T-12 (both reservation lines shown).</w:t>
       </w:r>
     </w:p>
     <w:p>
@@ -1161,7 +1254,12 @@
         <w:t>internal locations</w:t>
       </w:r>
       <w:r>
-        <w:t xml:space="preserve"> for the warehouse + period:</w:t>
+        <w:t xml:space="preserve"> for the warehouse + period,</w:t>
+      </w:r>
+    </w:p>
+    <w:p>
+      <w:r>
+        <w:t>plus the reservation split:</w:t>
       </w:r>
     </w:p>
     <w:p>
@@ -1194,15 +1292,10 @@
         <w:rPr>
           <w:b/>
         </w:rPr>
-        <w:t>In Repair</w:t>
-      </w:r>
-      <w:r>
-        <w:t xml:space="preserve"> = open-repair qty (only if `repair` installed; shown as its own line</w:t>
-      </w:r>
-    </w:p>
-    <w:p>
-      <w:r>
-        <w:t xml:space="preserve">  because the unit still sits in a physical location and would otherwise be hidden),</w:t>
+        <w:t>Reserved by this order</w:t>
+      </w:r>
+      <w:r>
+        <w:t xml:space="preserve"> — available to this order (§3.3),</w:t>
       </w:r>
     </w:p>
     <w:p>
@@ -1213,10 +1306,48 @@
         <w:rPr>
           <w:b/>
         </w:rPr>
-        <w:t>Pickable</w:t>
-      </w:r>
-      <w:r>
-        <w:t xml:space="preserve"> = usable-stock on-hand − in-repair (the net staff can ship now).</w:t>
+        <w:t>Reserved by other orders</w:t>
+      </w:r>
+      <w:r>
+        <w:t xml:space="preserve"> — not available to this order (§3.3),</w:t>
+      </w:r>
+    </w:p>
+    <w:p>
+      <w:pPr>
+        <w:pStyle w:val="ListBullet"/>
+      </w:pPr>
+      <w:r>
+        <w:rPr>
+          <w:b/>
+        </w:rPr>
+        <w:t>In Repair</w:t>
+      </w:r>
+      <w:r>
+        <w:t xml:space="preserve"> = open-repair qty (only if `repair` installed; shown as its own line</w:t>
+      </w:r>
+    </w:p>
+    <w:p>
+      <w:r>
+        <w:t xml:space="preserve">  because the unit still sits in a physical location and would otherwise be hidden),</w:t>
+      </w:r>
+    </w:p>
+    <w:p>
+      <w:pPr>
+        <w:pStyle w:val="ListBullet"/>
+      </w:pPr>
+      <w:r>
+        <w:rPr>
+          <w:b/>
+        </w:rPr>
+        <w:t>Pickable / Available to this order</w:t>
+      </w:r>
+      <w:r>
+        <w:t xml:space="preserve"> = usable-stock on-hand − reserved-by-others −</w:t>
+      </w:r>
+    </w:p>
+    <w:p>
+      <w:r>
+        <w:t xml:space="preserve">  in-repair (+ reserved-by-this-order counts as available to itself).</w:t>
       </w:r>
     </w:p>
     <w:p>
@@ -1488,24 +1619,38 @@
         <w:rPr>
           <w:b/>
         </w:rPr>
-        <w:t>In Repair</w:t>
-      </w:r>
-      <w:r>
-        <w:t xml:space="preserve"> (if repair installed), and net</w:t>
+        <w:t>Reserved by this order</w:t>
+      </w:r>
+      <w:r>
+        <w:t>, **Reserved by</w:t>
       </w:r>
     </w:p>
     <w:p>
       <w:r>
-        <w:t xml:space="preserve">  </w:t>
+        <w:t xml:space="preserve">  other orders</w:t>
       </w:r>
       <w:r>
         <w:rPr>
           <w:b/>
         </w:rPr>
-        <w:t>Pickable</w:t>
-      </w:r>
-      <w:r>
-        <w:t>.</w:t>
+        <w:t xml:space="preserve">, </w:t>
+      </w:r>
+      <w:r>
+        <w:t>In Repair</w:t>
+      </w:r>
+      <w:r>
+        <w:rPr>
+          <w:b/>
+        </w:rPr>
+        <w:t xml:space="preserve"> (if repair installed), and net </w:t>
+      </w:r>
+      <w:r>
+        <w:t>Pickable / Available to</w:t>
+      </w:r>
+    </w:p>
+    <w:p>
+      <w:r>
+        <w:t xml:space="preserve">  this order**.</w:t>
       </w:r>
     </w:p>
     <w:p>
@@ -1534,6 +1679,43 @@
       </w:r>
       <w:r>
         <w:t xml:space="preserve"> Read-only; adds no blocking behaviour.</w:t>
+      </w:r>
+    </w:p>
+    <w:p>
+      <w:pPr>
+        <w:pStyle w:val="ListBullet"/>
+      </w:pPr>
+      <w:r>
+        <w:rPr>
+          <w:b/>
+        </w:rPr>
+        <w:t>RAV-13</w:t>
+      </w:r>
+      <w:r>
+        <w:t xml:space="preserve"> The </w:t>
+      </w:r>
+      <w:r>
+        <w:rPr>
+          <w:b/>
+        </w:rPr>
+        <w:t>Reserved by this order</w:t>
+      </w:r>
+      <w:r>
+        <w:t xml:space="preserve"> and </w:t>
+      </w:r>
+      <w:r>
+        <w:rPr>
+          <w:b/>
+        </w:rPr>
+        <w:t>Reserved by other orders</w:t>
+      </w:r>
+      <w:r>
+        <w:t xml:space="preserve"> lines are</w:t>
+      </w:r>
+    </w:p>
+    <w:p>
+      <w:r>
+        <w:t xml:space="preserve">  always shown (rental storable lines), making the own-demand handling auditable.</w:t>
       </w:r>
     </w:p>
     <w:p>
@@ -2308,6 +2490,52 @@
           </w:p>
         </w:tc>
       </w:tr>
+      <w:tr>
+        <w:tc>
+          <w:tcPr>
+            <w:tcW w:type="dxa" w:w="2160"/>
+          </w:tcPr>
+          <w:p>
+            <w:r/>
+            <w:r>
+              <w:t>T-12</w:t>
+            </w:r>
+          </w:p>
+        </w:tc>
+        <w:tc>
+          <w:tcPr>
+            <w:tcW w:type="dxa" w:w="2160"/>
+          </w:tcPr>
+          <w:p>
+            <w:r/>
+            <w:r>
+              <w:t>test_reservation_split_shown</w:t>
+            </w:r>
+          </w:p>
+        </w:tc>
+        <w:tc>
+          <w:tcPr>
+            <w:tcW w:type="dxa" w:w="2160"/>
+          </w:tcPr>
+          <w:p>
+            <w:r/>
+            <w:r>
+              <w:t>pop-up exposes Reserved-by-this-order and Reserved-by-other-orders with correct values</w:t>
+            </w:r>
+          </w:p>
+        </w:tc>
+        <w:tc>
+          <w:tcPr>
+            <w:tcW w:type="dxa" w:w="2160"/>
+          </w:tcPr>
+          <w:p>
+            <w:r/>
+            <w:r>
+              <w:t>RAV-13</w:t>
+            </w:r>
+          </w:p>
+        </w:tc>
+      </w:tr>
     </w:tbl>
     <w:p>
       <w:r>

</xml_diff>

<commit_message>
docs: rental_availability requirements v4 (drop redundant 'At Customer' line)
Units at a customer are already represented, period-correctly, inside
'Reserved by other orders' (or this order). A separate 'At Customer' line
would double-count and, being period-blind, wrongly reduce availability for
future rentals the unit returns in time for. Clarify that 'Reserved by ...'
means period-aware rental commitment (same basis as _get_unavailable_qty).
Adds test T-13; updates T-08.

Co-Authored-By: Claude Opus 4.8 <noreply@anthropic.com>
Claude-Session: https://claude.ai/code/session_015UyktmijNHjiCtQB359rzX
</commit_message>
<xml_diff>
--- a/docs/rental_availability_requirements.docx
+++ b/docs/rental_availability_requirements.docx
@@ -15,7 +15,7 @@
         <w:rPr>
           <w:i/>
         </w:rPr>
-        <w:t>Functional &amp; Technical Requirements, Goals &amp; Tests — Backend / Sales (Rental) + Inventory (v3, for approval)</w:t>
+        <w:t>Functional &amp; Technical Requirements, Goals &amp; Tests — Backend / Sales (Rental) + Inventory (v4, for approval)</w:t>
       </w:r>
     </w:p>
     <w:tbl>
@@ -495,116 +495,60 @@
       </w:r>
     </w:p>
     <w:p>
-      <w:pPr>
-        <w:pStyle w:val="Heading1"/>
-      </w:pPr>
-      <w:r>
-        <w:t>1. Purpose &amp; Business Context</w:t>
-      </w:r>
-    </w:p>
-    <w:p>
-      <w:r>
-        <w:t xml:space="preserve">Rental staff need a </w:t>
+      <w:r>
+        <w:t xml:space="preserve">8. </w:t>
       </w:r>
       <w:r>
         <w:rPr>
           <w:b/>
         </w:rPr>
-        <w:t>trustworthy "available for this period" figure</w:t>
-      </w:r>
-      <w:r>
-        <w:t xml:space="preserve"> and a way to</w:t>
+        <w:t>"At Customer" line removed (v4).</w:t>
+      </w:r>
+      <w:r>
+        <w:t xml:space="preserve"> A unit physically at a customer is a unit</w:t>
       </w:r>
     </w:p>
     <w:p>
+      <w:r>
+        <w:t xml:space="preserve">   </w:t>
+      </w:r>
       <w:r>
         <w:rPr>
           <w:b/>
         </w:rPr>
-        <w:t>see where the stock actually is</w:t>
-      </w:r>
-      <w:r>
-        <w:t>. Two gaps cause wrong numbers and confusion:</w:t>
+        <w:t>committed to an order</w:t>
+      </w:r>
+      <w:r>
+        <w:t>, so it is already represented (period-correctly) inside</w:t>
       </w:r>
     </w:p>
     <w:p>
       <w:r>
-        <w:t xml:space="preserve">1. </w:t>
+        <w:t xml:space="preserve">   </w:t>
       </w:r>
       <w:r>
         <w:rPr>
           <w:b/>
         </w:rPr>
-        <w:t>Repairs are invisible to availability.</w:t>
-      </w:r>
-      <w:r>
-        <w:t xml:space="preserve"> A broken unit in an open repair order is</w:t>
+        <w:t>Reserved by other orders</w:t>
+      </w:r>
+      <w:r>
+        <w:t xml:space="preserve"> (or this order). A separate "At Customer" line would</w:t>
       </w:r>
     </w:p>
     <w:p>
       <w:r>
-        <w:t xml:space="preserve">   physically present but </w:t>
-      </w:r>
-      <w:r>
-        <w:rPr>
-          <w:b/>
-        </w:rPr>
-        <w:t>not rentable</w:t>
-      </w:r>
-      <w:r>
-        <w:t xml:space="preserve"> — yet standard availability still counts it.</w:t>
+        <w:t xml:space="preserve">   double-count it — and, being period-blind, would wrongly reduce availability for a</w:t>
       </w:r>
     </w:p>
     <w:p>
       <w:r>
-        <w:t xml:space="preserve">2. </w:t>
-      </w:r>
-      <w:r>
-        <w:rPr>
-          <w:b/>
-        </w:rPr>
-        <w:t>The figure is a single opaque number.</w:t>
-      </w:r>
-      <w:r>
-        <w:t xml:space="preserve"> Staff cannot see that (e.g.) of 10 units, 3</w:t>
+        <w:t xml:space="preserve">   future rental that the unit returns in time for. The period-aware reserved/other-orders</w:t>
       </w:r>
     </w:p>
     <w:p>
       <w:r>
-        <w:t xml:space="preserve">   are at a customer, 2 are in QC (not put away), 1 is in repair — so only 4 are pickable.</w:t>
-      </w:r>
-    </w:p>
-    <w:p>
-      <w:r>
-        <w:t xml:space="preserve">Separately, </w:t>
-      </w:r>
-      <w:r>
-        <w:rPr>
-          <w:b/>
-        </w:rPr>
-        <w:t>set availability</w:t>
-      </w:r>
-      <w:r>
-        <w:t xml:space="preserve"> (rental_set) uses custom own-demand/competing-demand</w:t>
-      </w:r>
-    </w:p>
-    <w:p>
-      <w:r>
-        <w:t xml:space="preserve">math that is fragile. It should be the </w:t>
-      </w:r>
-      <w:r>
-        <w:rPr>
-          <w:b/>
-        </w:rPr>
-        <w:t>limiting component's whole-set count</w:t>
-      </w:r>
-      <w:r>
-        <w:t>, built on</w:t>
-      </w:r>
-    </w:p>
-    <w:p>
-      <w:r>
-        <w:t>the same (now repair-aware) component availability, with own-demand handled correctly.</w:t>
+        <w:t xml:space="preserve">   figure is the correct and sufficient representation.</w:t>
       </w:r>
     </w:p>
     <w:p>
@@ -612,6 +556,119 @@
         <w:pStyle w:val="Heading1"/>
       </w:pPr>
       <w:r>
+        <w:t>1. Purpose &amp; Business Context</w:t>
+      </w:r>
+    </w:p>
+    <w:p>
+      <w:r>
+        <w:t xml:space="preserve">Rental staff need a </w:t>
+      </w:r>
+      <w:r>
+        <w:rPr>
+          <w:b/>
+        </w:rPr>
+        <w:t>trustworthy "available for this period" figure</w:t>
+      </w:r>
+      <w:r>
+        <w:t xml:space="preserve"> and a way to</w:t>
+      </w:r>
+    </w:p>
+    <w:p>
+      <w:r>
+        <w:rPr>
+          <w:b/>
+        </w:rPr>
+        <w:t>see where the stock actually is</w:t>
+      </w:r>
+      <w:r>
+        <w:t>. Two gaps cause wrong numbers and confusion:</w:t>
+      </w:r>
+    </w:p>
+    <w:p>
+      <w:r>
+        <w:t xml:space="preserve">1. </w:t>
+      </w:r>
+      <w:r>
+        <w:rPr>
+          <w:b/>
+        </w:rPr>
+        <w:t>Repairs are invisible to availability.</w:t>
+      </w:r>
+      <w:r>
+        <w:t xml:space="preserve"> A broken unit in an open repair order is</w:t>
+      </w:r>
+    </w:p>
+    <w:p>
+      <w:r>
+        <w:t xml:space="preserve">   physically present but </w:t>
+      </w:r>
+      <w:r>
+        <w:rPr>
+          <w:b/>
+        </w:rPr>
+        <w:t>not rentable</w:t>
+      </w:r>
+      <w:r>
+        <w:t xml:space="preserve"> — yet standard availability still counts it.</w:t>
+      </w:r>
+    </w:p>
+    <w:p>
+      <w:r>
+        <w:t xml:space="preserve">2. </w:t>
+      </w:r>
+      <w:r>
+        <w:rPr>
+          <w:b/>
+        </w:rPr>
+        <w:t>The figure is a single opaque number.</w:t>
+      </w:r>
+      <w:r>
+        <w:t xml:space="preserve"> Staff cannot see that (e.g.) of 10 units, 3</w:t>
+      </w:r>
+    </w:p>
+    <w:p>
+      <w:r>
+        <w:t xml:space="preserve">   are at a customer, 2 are in QC (not put away), 1 is in repair — so only 4 are pickable.</w:t>
+      </w:r>
+    </w:p>
+    <w:p>
+      <w:r>
+        <w:t xml:space="preserve">Separately, </w:t>
+      </w:r>
+      <w:r>
+        <w:rPr>
+          <w:b/>
+        </w:rPr>
+        <w:t>set availability</w:t>
+      </w:r>
+      <w:r>
+        <w:t xml:space="preserve"> (rental_set) uses custom own-demand/competing-demand</w:t>
+      </w:r>
+    </w:p>
+    <w:p>
+      <w:r>
+        <w:t xml:space="preserve">math that is fragile. It should be the </w:t>
+      </w:r>
+      <w:r>
+        <w:rPr>
+          <w:b/>
+        </w:rPr>
+        <w:t>limiting component's whole-set count</w:t>
+      </w:r>
+      <w:r>
+        <w:t>, built on</w:t>
+      </w:r>
+    </w:p>
+    <w:p>
+      <w:r>
+        <w:t>the same (now repair-aware) component availability, with own-demand handled correctly.</w:t>
+      </w:r>
+    </w:p>
+    <w:p>
+      <w:pPr>
+        <w:pStyle w:val="Heading1"/>
+      </w:pPr>
+      <w:r>
         <w:t>2. Background &amp; Root-Cause (verified in code)</w:t>
       </w:r>
     </w:p>
@@ -1251,15 +1308,15 @@
         <w:rPr>
           <w:b/>
         </w:rPr>
-        <w:t>internal locations</w:t>
-      </w:r>
-      <w:r>
-        <w:t xml:space="preserve"> for the warehouse + period,</w:t>
+        <w:t>warehouse internal locations</w:t>
+      </w:r>
+      <w:r>
+        <w:t xml:space="preserve"> + the</w:t>
       </w:r>
     </w:p>
     <w:p>
       <w:r>
-        <w:t>plus the reservation split:</w:t>
+        <w:t>period-aware reservation split (no separate "At Customer" line — see §0.8):</w:t>
       </w:r>
     </w:p>
     <w:p>
@@ -1267,7 +1324,7 @@
         <w:pStyle w:val="ListBullet"/>
       </w:pPr>
       <w:r>
-        <w:t>per-location on-hand (Input / Quality Control / Stock …),</w:t>
+        <w:t>per-location on-hand in the warehouse (Input / Quality Control / Stock …),</w:t>
       </w:r>
     </w:p>
     <w:p>
@@ -1278,10 +1335,24 @@
         <w:rPr>
           <w:b/>
         </w:rPr>
-        <w:t>At Customer</w:t>
-      </w:r>
-      <w:r>
-        <w:t xml:space="preserve"> = the rental location's on-hand (rented out),</w:t>
+        <w:t>Reserved by this order</w:t>
+      </w:r>
+      <w:r>
+        <w:t xml:space="preserve"> — period-overlapping commitment of *this* order (its</w:t>
+      </w:r>
+    </w:p>
+    <w:p>
+      <w:r>
+        <w:t xml:space="preserve">  reservations + not-yet-returned deliveries); </w:t>
+      </w:r>
+      <w:r>
+        <w:rPr>
+          <w:b/>
+        </w:rPr>
+        <w:t>available to this order</w:t>
+      </w:r>
+      <w:r>
+        <w:t xml:space="preserve"> (§3.3),</w:t>
       </w:r>
     </w:p>
     <w:p>
@@ -1292,10 +1363,24 @@
         <w:rPr>
           <w:b/>
         </w:rPr>
-        <w:t>Reserved by this order</w:t>
-      </w:r>
-      <w:r>
-        <w:t xml:space="preserve"> — available to this order (§3.3),</w:t>
+        <w:t>Reserved by other orders</w:t>
+      </w:r>
+      <w:r>
+        <w:t xml:space="preserve"> — period-overlapping commitment of *other* orders</w:t>
+      </w:r>
+    </w:p>
+    <w:p>
+      <w:r>
+        <w:t xml:space="preserve">  (includes their units still out at customers); </w:t>
+      </w:r>
+      <w:r>
+        <w:rPr>
+          <w:b/>
+        </w:rPr>
+        <w:t>not</w:t>
+      </w:r>
+      <w:r>
+        <w:t xml:space="preserve"> available to this order (§3.3),</w:t>
       </w:r>
     </w:p>
     <w:p>
@@ -1306,10 +1391,15 @@
         <w:rPr>
           <w:b/>
         </w:rPr>
-        <w:t>Reserved by other orders</w:t>
-      </w:r>
-      <w:r>
-        <w:t xml:space="preserve"> — not available to this order (§3.3),</w:t>
+        <w:t>In Repair</w:t>
+      </w:r>
+      <w:r>
+        <w:t xml:space="preserve"> = open-repair qty (only if `repair` installed; shown as its own line</w:t>
+      </w:r>
+    </w:p>
+    <w:p>
+      <w:r>
+        <w:t xml:space="preserve">  because the unit still sits in a physical location and would otherwise be hidden),</w:t>
       </w:r>
     </w:p>
     <w:p>
@@ -1320,15 +1410,47 @@
         <w:rPr>
           <w:b/>
         </w:rPr>
-        <w:t>In Repair</w:t>
-      </w:r>
-      <w:r>
-        <w:t xml:space="preserve"> = open-repair qty (only if `repair` installed; shown as its own line</w:t>
+        <w:t>Pickable / Available to this order</w:t>
+      </w:r>
+      <w:r>
+        <w:t xml:space="preserve"> = usable-stock on-hand − reserved-by-others −</w:t>
       </w:r>
     </w:p>
     <w:p>
       <w:r>
-        <w:t xml:space="preserve">  because the unit still sits in a physical location and would otherwise be hidden),</w:t>
+        <w:t xml:space="preserve">  in-repair (+ reserved-by-this-order counts as available to itself).</w:t>
+      </w:r>
+    </w:p>
+    <w:p>
+      <w:r>
+        <w:t xml:space="preserve">*Note:* "Reserved by …" here means the </w:t>
+      </w:r>
+      <w:r>
+        <w:rPr>
+          <w:b/>
+        </w:rPr>
+        <w:t>period-aware rental commitment</w:t>
+      </w:r>
+      <w:r>
+        <w:t xml:space="preserve"> (the same basis</w:t>
+      </w:r>
+    </w:p>
+    <w:p>
+      <w:r>
+        <w:t>as `_get_unavailable_qty`), not merely current stock reservations — that is what lets it</w:t>
+      </w:r>
+    </w:p>
+    <w:p>
+      <w:r>
+        <w:t>correctly absorb units currently at a customer without a separate, period-blind line.</w:t>
+      </w:r>
+    </w:p>
+    <w:p>
+      <w:pPr>
+        <w:pStyle w:val="Heading1"/>
+      </w:pPr>
+      <w:r>
+        <w:t>4. Goals</w:t>
       </w:r>
     </w:p>
     <w:p>
@@ -1339,15 +1461,118 @@
         <w:rPr>
           <w:b/>
         </w:rPr>
-        <w:t>Pickable / Available to this order</w:t>
-      </w:r>
-      <w:r>
-        <w:t xml:space="preserve"> = usable-stock on-hand − reserved-by-others −</w:t>
+        <w:t>G1</w:t>
+      </w:r>
+      <w:r>
+        <w:t xml:space="preserve"> Availability excludes units in open repair over the repair window — **only when</w:t>
       </w:r>
     </w:p>
     <w:p>
       <w:r>
-        <w:t xml:space="preserve">  in-repair (+ reserved-by-this-order counts as available to itself).</w:t>
+        <w:t xml:space="preserve">  `repair` is installed**, and never crashes when it isn't.</w:t>
+      </w:r>
+    </w:p>
+    <w:p>
+      <w:pPr>
+        <w:pStyle w:val="ListBullet"/>
+      </w:pPr>
+      <w:r>
+        <w:rPr>
+          <w:b/>
+        </w:rPr>
+        <w:t>G2</w:t>
+      </w:r>
+      <w:r>
+        <w:t xml:space="preserve"> The pop-up shows a location-driven breakdown (incl. At Customer and, if present,</w:t>
+      </w:r>
+    </w:p>
+    <w:p>
+      <w:r>
+        <w:t xml:space="preserve">  In Repair) and the net </w:t>
+      </w:r>
+      <w:r>
+        <w:rPr>
+          <w:b/>
+        </w:rPr>
+        <w:t>Pickable</w:t>
+      </w:r>
+      <w:r>
+        <w:t xml:space="preserve"> figure.</w:t>
+      </w:r>
+    </w:p>
+    <w:p>
+      <w:pPr>
+        <w:pStyle w:val="ListBullet"/>
+      </w:pPr>
+      <w:r>
+        <w:rPr>
+          <w:b/>
+        </w:rPr>
+        <w:t>G3</w:t>
+      </w:r>
+      <w:r>
+        <w:t xml:space="preserve"> Set availability is the limiting component's whole-set count, built on the same</w:t>
+      </w:r>
+    </w:p>
+    <w:p>
+      <w:r>
+        <w:t xml:space="preserve">  component availability.</w:t>
+      </w:r>
+    </w:p>
+    <w:p>
+      <w:pPr>
+        <w:pStyle w:val="ListBullet"/>
+      </w:pPr>
+      <w:r>
+        <w:rPr>
+          <w:b/>
+        </w:rPr>
+        <w:t>G4</w:t>
+      </w:r>
+      <w:r>
+        <w:t xml:space="preserve"> No custom padding logic — standard preparation/padding config only.</w:t>
+      </w:r>
+    </w:p>
+    <w:p>
+      <w:pPr>
+        <w:pStyle w:val="ListBullet"/>
+      </w:pPr>
+      <w:r>
+        <w:rPr>
+          <w:b/>
+        </w:rPr>
+        <w:t>G5</w:t>
+      </w:r>
+      <w:r>
+        <w:t xml:space="preserve"> </w:t>
+      </w:r>
+      <w:r>
+        <w:rPr>
+          <w:b/>
+        </w:rPr>
+        <w:t>No double-count:</w:t>
+      </w:r>
+      <w:r>
+        <w:t xml:space="preserve"> a confirmed order sees its own reserved units as available</w:t>
+      </w:r>
+    </w:p>
+    <w:p>
+      <w:r>
+        <w:t xml:space="preserve">  to itself (verified, not assumed).</w:t>
+      </w:r>
+    </w:p>
+    <w:p>
+      <w:pPr>
+        <w:pStyle w:val="ListBullet"/>
+      </w:pPr>
+      <w:r>
+        <w:rPr>
+          <w:b/>
+        </w:rPr>
+        <w:t>G6</w:t>
+      </w:r>
+      <w:r>
+        <w:t xml:space="preserve"> Small, isolated footprint inside rental_set; native forecast engine not rewritten.</w:t>
       </w:r>
     </w:p>
     <w:p>
@@ -1355,7 +1580,15 @@
         <w:pStyle w:val="Heading1"/>
       </w:pPr>
       <w:r>
-        <w:t>4. Goals</w:t>
+        <w:t>5. Functional Requirements</w:t>
+      </w:r>
+    </w:p>
+    <w:p>
+      <w:pPr>
+        <w:pStyle w:val="Heading2"/>
+      </w:pPr>
+      <w:r>
+        <w:t>5.1 Repair-aware availability (RAV-01…04)</w:t>
       </w:r>
     </w:p>
     <w:p>
@@ -1366,15 +1599,24 @@
         <w:rPr>
           <w:b/>
         </w:rPr>
-        <w:t>G1</w:t>
-      </w:r>
-      <w:r>
-        <w:t xml:space="preserve"> Availability excludes units in open repair over the repair window — **only when</w:t>
+        <w:t>RAV-01</w:t>
+      </w:r>
+      <w:r>
+        <w:t xml:space="preserve"> Availability is reduced by product qty tied up in </w:t>
+      </w:r>
+      <w:r>
+        <w:rPr>
+          <w:b/>
+        </w:rPr>
+        <w:t>open</w:t>
+      </w:r>
+      <w:r>
+        <w:t xml:space="preserve"> repairs</w:t>
       </w:r>
     </w:p>
     <w:p>
       <w:r>
-        <w:t xml:space="preserve">  `repair` is installed**, and never crashes when it isn't.</w:t>
+        <w:t xml:space="preserve">  (`state not in ('done','cancel')`) whose window overlaps the rental period.</w:t>
       </w:r>
     </w:p>
     <w:p>
@@ -1385,24 +1627,15 @@
         <w:rPr>
           <w:b/>
         </w:rPr>
-        <w:t>G2</w:t>
-      </w:r>
-      <w:r>
-        <w:t xml:space="preserve"> The pop-up shows a location-driven breakdown (incl. At Customer and, if present,</w:t>
+        <w:t>RAV-02</w:t>
+      </w:r>
+      <w:r>
+        <w:t xml:space="preserve"> Serial products: a repair on a `lot_id` removes that one unit; qty products:</w:t>
       </w:r>
     </w:p>
     <w:p>
       <w:r>
-        <w:t xml:space="preserve">  In Repair) and the net </w:t>
-      </w:r>
-      <w:r>
-        <w:rPr>
-          <w:b/>
-        </w:rPr>
-        <w:t>Pickable</w:t>
-      </w:r>
-      <w:r>
-        <w:t xml:space="preserve"> figure.</w:t>
+        <w:t xml:space="preserve">  remove `product_qty`.</w:t>
       </w:r>
     </w:p>
     <w:p>
@@ -1413,15 +1646,10 @@
         <w:rPr>
           <w:b/>
         </w:rPr>
-        <w:t>G3</w:t>
-      </w:r>
-      <w:r>
-        <w:t xml:space="preserve"> Set availability is the limiting component's whole-set count, built on the same</w:t>
-      </w:r>
-    </w:p>
-    <w:p>
-      <w:r>
-        <w:t xml:space="preserve">  component availability.</w:t>
+        <w:t>RAV-03</w:t>
+      </w:r>
+      <w:r>
+        <w:t xml:space="preserve"> `done`/`cancel` repairs do not reduce availability.</w:t>
       </w:r>
     </w:p>
     <w:p>
@@ -1432,10 +1660,27 @@
         <w:rPr>
           <w:b/>
         </w:rPr>
-        <w:t>G4</w:t>
-      </w:r>
-      <w:r>
-        <w:t xml:space="preserve"> No custom padding logic — standard preparation/padding config only.</w:t>
+        <w:t>RAV-04</w:t>
+      </w:r>
+      <w:r>
+        <w:t xml:space="preserve"> If `repair` is not installed: no deduction, no repair UI, </w:t>
+      </w:r>
+      <w:r>
+        <w:rPr>
+          <w:b/>
+        </w:rPr>
+        <w:t>no error</w:t>
+      </w:r>
+      <w:r>
+        <w:t>.</w:t>
+      </w:r>
+    </w:p>
+    <w:p>
+      <w:pPr>
+        <w:pStyle w:val="Heading2"/>
+      </w:pPr>
+      <w:r>
+        <w:t>5.2 Availability pop-up breakdown (RAV-05…07)</w:t>
       </w:r>
     </w:p>
     <w:p>
@@ -1446,174 +1691,15 @@
         <w:rPr>
           <w:b/>
         </w:rPr>
-        <w:t>G5</w:t>
-      </w:r>
-      <w:r>
-        <w:t xml:space="preserve"> </w:t>
-      </w:r>
-      <w:r>
-        <w:rPr>
-          <w:b/>
-        </w:rPr>
-        <w:t>No double-count:</w:t>
-      </w:r>
-      <w:r>
-        <w:t xml:space="preserve"> a confirmed order sees its own reserved units as available</w:t>
+        <w:t>RAV-05</w:t>
+      </w:r>
+      <w:r>
+        <w:t xml:space="preserve"> Show, for the picking warehouse + period: per-internal-location on-hand</w:t>
       </w:r>
     </w:p>
     <w:p>
       <w:r>
-        <w:t xml:space="preserve">  to itself (verified, not assumed).</w:t>
-      </w:r>
-    </w:p>
-    <w:p>
-      <w:pPr>
-        <w:pStyle w:val="ListBullet"/>
-      </w:pPr>
-      <w:r>
-        <w:rPr>
-          <w:b/>
-        </w:rPr>
-        <w:t>G6</w:t>
-      </w:r>
-      <w:r>
-        <w:t xml:space="preserve"> Small, isolated footprint inside rental_set; native forecast engine not rewritten.</w:t>
-      </w:r>
-    </w:p>
-    <w:p>
-      <w:pPr>
-        <w:pStyle w:val="Heading1"/>
-      </w:pPr>
-      <w:r>
-        <w:t>5. Functional Requirements</w:t>
-      </w:r>
-    </w:p>
-    <w:p>
-      <w:pPr>
-        <w:pStyle w:val="Heading2"/>
-      </w:pPr>
-      <w:r>
-        <w:t>5.1 Repair-aware availability (RAV-01…04)</w:t>
-      </w:r>
-    </w:p>
-    <w:p>
-      <w:pPr>
-        <w:pStyle w:val="ListBullet"/>
-      </w:pPr>
-      <w:r>
-        <w:rPr>
-          <w:b/>
-        </w:rPr>
-        <w:t>RAV-01</w:t>
-      </w:r>
-      <w:r>
-        <w:t xml:space="preserve"> Availability is reduced by product qty tied up in </w:t>
-      </w:r>
-      <w:r>
-        <w:rPr>
-          <w:b/>
-        </w:rPr>
-        <w:t>open</w:t>
-      </w:r>
-      <w:r>
-        <w:t xml:space="preserve"> repairs</w:t>
-      </w:r>
-    </w:p>
-    <w:p>
-      <w:r>
-        <w:t xml:space="preserve">  (`state not in ('done','cancel')`) whose window overlaps the rental period.</w:t>
-      </w:r>
-    </w:p>
-    <w:p>
-      <w:pPr>
-        <w:pStyle w:val="ListBullet"/>
-      </w:pPr>
-      <w:r>
-        <w:rPr>
-          <w:b/>
-        </w:rPr>
-        <w:t>RAV-02</w:t>
-      </w:r>
-      <w:r>
-        <w:t xml:space="preserve"> Serial products: a repair on a `lot_id` removes that one unit; qty products:</w:t>
-      </w:r>
-    </w:p>
-    <w:p>
-      <w:r>
-        <w:t xml:space="preserve">  remove `product_qty`.</w:t>
-      </w:r>
-    </w:p>
-    <w:p>
-      <w:pPr>
-        <w:pStyle w:val="ListBullet"/>
-      </w:pPr>
-      <w:r>
-        <w:rPr>
-          <w:b/>
-        </w:rPr>
-        <w:t>RAV-03</w:t>
-      </w:r>
-      <w:r>
-        <w:t xml:space="preserve"> `done`/`cancel` repairs do not reduce availability.</w:t>
-      </w:r>
-    </w:p>
-    <w:p>
-      <w:pPr>
-        <w:pStyle w:val="ListBullet"/>
-      </w:pPr>
-      <w:r>
-        <w:rPr>
-          <w:b/>
-        </w:rPr>
-        <w:t>RAV-04</w:t>
-      </w:r>
-      <w:r>
-        <w:t xml:space="preserve"> If `repair` is not installed: no deduction, no repair UI, </w:t>
-      </w:r>
-      <w:r>
-        <w:rPr>
-          <w:b/>
-        </w:rPr>
-        <w:t>no error</w:t>
-      </w:r>
-      <w:r>
-        <w:t>.</w:t>
-      </w:r>
-    </w:p>
-    <w:p>
-      <w:pPr>
-        <w:pStyle w:val="Heading2"/>
-      </w:pPr>
-      <w:r>
-        <w:t>5.2 Availability pop-up breakdown (RAV-05…07)</w:t>
-      </w:r>
-    </w:p>
-    <w:p>
-      <w:pPr>
-        <w:pStyle w:val="ListBullet"/>
-      </w:pPr>
-      <w:r>
-        <w:rPr>
-          <w:b/>
-        </w:rPr>
-        <w:t>RAV-05</w:t>
-      </w:r>
-      <w:r>
-        <w:t xml:space="preserve"> Show, for the picking warehouse + period: per-internal-location on-hand</w:t>
-      </w:r>
-    </w:p>
-    <w:p>
-      <w:r>
         <w:t xml:space="preserve">  (Input / QC / Stock …), </w:t>
-      </w:r>
-      <w:r>
-        <w:rPr>
-          <w:b/>
-        </w:rPr>
-        <w:t>At Customer</w:t>
-      </w:r>
-      <w:r>
-        <w:t xml:space="preserve">, </w:t>
       </w:r>
       <w:r>
         <w:rPr>
@@ -1622,35 +1708,49 @@
         <w:t>Reserved by this order</w:t>
       </w:r>
       <w:r>
-        <w:t>, **Reserved by</w:t>
-      </w:r>
-    </w:p>
-    <w:p>
-      <w:r>
-        <w:t xml:space="preserve">  other orders</w:t>
+        <w:t xml:space="preserve">, </w:t>
       </w:r>
       <w:r>
         <w:rPr>
           <w:b/>
         </w:rPr>
-        <w:t xml:space="preserve">, </w:t>
-      </w:r>
-      <w:r>
-        <w:t>In Repair</w:t>
+        <w:t>Reserved by other orders</w:t>
+      </w:r>
+      <w:r>
+        <w:t>,</w:t>
+      </w:r>
+    </w:p>
+    <w:p>
+      <w:r>
+        <w:t xml:space="preserve">  </w:t>
       </w:r>
       <w:r>
         <w:rPr>
           <w:b/>
         </w:rPr>
+        <w:t>In Repair</w:t>
+      </w:r>
+      <w:r>
         <w:t xml:space="preserve"> (if repair installed), and net </w:t>
       </w:r>
       <w:r>
-        <w:t>Pickable / Available to</w:t>
+        <w:rPr>
+          <w:b/>
+        </w:rPr>
+        <w:t>Pickable / Available to this order</w:t>
+      </w:r>
+      <w:r>
+        <w:t>.</w:t>
       </w:r>
     </w:p>
     <w:p>
       <w:r>
-        <w:t xml:space="preserve">  this order**.</w:t>
+        <w:t xml:space="preserve">  No separate "At Customer" line — those units are already inside the reserved figures</w:t>
+      </w:r>
+    </w:p>
+    <w:p>
+      <w:r>
+        <w:t xml:space="preserve">  (§0.8).</w:t>
       </w:r>
     </w:p>
     <w:p>
@@ -2325,7 +2425,7 @@
           <w:p>
             <w:r/>
             <w:r>
-              <w:t>test_breakdown_is_location_consistent</w:t>
+              <w:t>test_breakdown_is_consistent</w:t>
             </w:r>
           </w:p>
         </w:tc>
@@ -2336,7 +2436,7 @@
           <w:p>
             <w:r/>
             <w:r>
-              <w:t>breakdown: Σ per-location on-hand and Pickable = usable on-hand − in-repair</w:t>
+              <w:t>Pickable = usable on-hand − reserved-by-others − in-repair; no double-count of at-customer units</w:t>
             </w:r>
           </w:p>
         </w:tc>
@@ -2348,6 +2448,52 @@
             <w:r/>
             <w:r>
               <w:t>RAV-05</w:t>
+            </w:r>
+          </w:p>
+        </w:tc>
+      </w:tr>
+      <w:tr>
+        <w:tc>
+          <w:tcPr>
+            <w:tcW w:type="dxa" w:w="2160"/>
+          </w:tcPr>
+          <w:p>
+            <w:r/>
+            <w:r>
+              <w:t>T-13</w:t>
+            </w:r>
+          </w:p>
+        </w:tc>
+        <w:tc>
+          <w:tcPr>
+            <w:tcW w:type="dxa" w:w="2160"/>
+          </w:tcPr>
+          <w:p>
+            <w:r/>
+            <w:r>
+              <w:t>test_at_customer_not_double_counted</w:t>
+            </w:r>
+          </w:p>
+        </w:tc>
+        <w:tc>
+          <w:tcPr>
+            <w:tcW w:type="dxa" w:w="2160"/>
+          </w:tcPr>
+          <w:p>
+            <w:r/>
+            <w:r>
+              <w:t>a unit out at a customer for another order is reflected once (via reserved-by-others), and a future period it returns in time for is not reduced</w:t>
+            </w:r>
+          </w:p>
+        </w:tc>
+        <w:tc>
+          <w:tcPr>
+            <w:tcW w:type="dxa" w:w="2160"/>
+          </w:tcPr>
+          <w:p>
+            <w:r/>
+            <w:r>
+              <w:t>§0.8</w:t>
             </w:r>
           </w:p>
         </w:tc>

</xml_diff>

<commit_message>
rental_set: pop-up accounting flow (Total - Others - Repair = Available for Rent)
Confirmed (per review) that rental registers BOTH pickup and return transfers
at order confirmation, so native availability already handles 'returned early
-> available' correctly; verified Total - Reserved(others) - Repair equals the
native figure exactly for overlapping AND future periods. No forecast change.

Pop-up reordered into an accounting flow:
  Total stock - Reserved by other orders - In Repair = Available for Rent
  (of which reserved for this order)
  Located in: Input / QC / Stock
Total stock computed as Available + Reserved(others) + In Repair, so it is
warehouse-scoped and always reconciles. New rental_total_stock field; T-08
adds the reconciliation identity; T-13 restored to assert full availability
after the competing order returns. Docs v5.

Co-Authored-By: Claude Opus 4.8 <noreply@anthropic.com>
Claude-Session: https://claude.ai/code/session_015UyktmijNHjiCtQB359rzX
</commit_message>
<xml_diff>
--- a/docs/rental_availability_requirements.docx
+++ b/docs/rental_availability_requirements.docx
@@ -15,7 +15,7 @@
         <w:rPr>
           <w:i/>
         </w:rPr>
-        <w:t>Functional &amp; Technical Requirements, Goals &amp; Tests — Backend / Sales (Rental) + Inventory (v4, for approval)</w:t>
+        <w:t>Functional &amp; Technical Requirements, Goals &amp; Tests — Backend / Sales (Rental) + Inventory (v5, for approval)</w:t>
       </w:r>
     </w:p>
     <w:tbl>
@@ -552,116 +552,119 @@
       </w:r>
     </w:p>
     <w:p>
-      <w:pPr>
-        <w:pStyle w:val="Heading1"/>
-      </w:pPr>
-      <w:r>
-        <w:t>1. Purpose &amp; Business Context</w:t>
-      </w:r>
-    </w:p>
-    <w:p>
-      <w:r>
-        <w:t xml:space="preserve">Rental staff need a </w:t>
+      <w:r>
+        <w:t xml:space="preserve">9. </w:t>
       </w:r>
       <w:r>
         <w:rPr>
           <w:b/>
         </w:rPr>
-        <w:t>trustworthy "available for this period" figure</w:t>
-      </w:r>
-      <w:r>
-        <w:t xml:space="preserve"> and a way to</w:t>
+        <w:t>Native forecast already handles "returned early → available" (v5).</w:t>
+      </w:r>
+      <w:r>
+        <w:t xml:space="preserve"> Verified in</w:t>
       </w:r>
     </w:p>
     <w:p>
+      <w:r>
+        <w:t xml:space="preserve">   code: confirming a rental order registers </w:t>
+      </w:r>
       <w:r>
         <w:rPr>
           <w:b/>
         </w:rPr>
-        <w:t>see where the stock actually is</w:t>
-      </w:r>
-      <w:r>
-        <w:t>. Two gaps cause wrong numbers and confusion:</w:t>
-      </w:r>
-    </w:p>
-    <w:p>
-      <w:r>
-        <w:t xml:space="preserve">1. </w:t>
+        <w:t>both</w:t>
+      </w:r>
+      <w:r>
+        <w:t xml:space="preserve"> the pickup </w:t>
       </w:r>
       <w:r>
         <w:rPr>
           <w:b/>
         </w:rPr>
-        <w:t>Repairs are invisible to availability.</w:t>
-      </w:r>
-      <w:r>
-        <w:t xml:space="preserve"> A broken unit in an open repair order is</w:t>
+        <w:t>and</w:t>
+      </w:r>
+      <w:r>
+        <w:t xml:space="preserve"> the return</w:t>
       </w:r>
     </w:p>
     <w:p>
       <w:r>
-        <w:t xml:space="preserve">   physically present but </w:t>
+        <w:t xml:space="preserve">   transfer immediately. So a competing order that returns before our period holds</w:t>
+      </w:r>
+    </w:p>
+    <w:p>
+      <w:r>
+        <w:t xml:space="preserve">   nothing during it, and the full stock is available again — the native figure is</w:t>
+      </w:r>
+    </w:p>
+    <w:p>
+      <w:r>
+        <w:t xml:space="preserve">   correct, with </w:t>
       </w:r>
       <w:r>
         <w:rPr>
           <w:b/>
         </w:rPr>
-        <w:t>not rentable</w:t>
-      </w:r>
-      <w:r>
-        <w:t xml:space="preserve"> — yet standard availability still counts it.</w:t>
+        <w:t>no forecast rewrite and no padding crutch needed</w:t>
+      </w:r>
+      <w:r>
+        <w:t xml:space="preserve"> for this case.</w:t>
       </w:r>
     </w:p>
     <w:p>
       <w:r>
-        <w:t xml:space="preserve">2. </w:t>
+        <w:t xml:space="preserve">   Consequently </w:t>
       </w:r>
       <w:r>
         <w:rPr>
           <w:b/>
         </w:rPr>
-        <w:t>The figure is a single opaque number.</w:t>
-      </w:r>
-      <w:r>
-        <w:t xml:space="preserve"> Staff cannot see that (e.g.) of 10 units, 3</w:t>
+        <w:t>Available for Rent = Total stock − Reserved(others) − In Repair</w:t>
       </w:r>
     </w:p>
     <w:p>
       <w:r>
-        <w:t xml:space="preserve">   are at a customer, 2 are in QC (not put away), 1 is in repair — so only 4 are pickable.</w:t>
+        <w:t xml:space="preserve">   equals the native availability figure *exactly* (checked for both overlapping and</w:t>
       </w:r>
     </w:p>
     <w:p>
       <w:r>
-        <w:t xml:space="preserve">Separately, </w:t>
+        <w:t xml:space="preserve">   future periods). There is therefore no "Option A vs B" — it is one number.</w:t>
+      </w:r>
+    </w:p>
+    <w:p>
+      <w:r>
+        <w:t xml:space="preserve">10. </w:t>
       </w:r>
       <w:r>
         <w:rPr>
           <w:b/>
         </w:rPr>
-        <w:t>set availability</w:t>
-      </w:r>
-      <w:r>
-        <w:t xml:space="preserve"> (rental_set) uses custom own-demand/competing-demand</w:t>
+        <w:t>Pop-up reordered to an accounting flow (v5).</w:t>
+      </w:r>
+      <w:r>
+        <w:t xml:space="preserve"> `Total stock − Reserved by other</w:t>
       </w:r>
     </w:p>
     <w:p>
       <w:r>
-        <w:t xml:space="preserve">math that is fragile. It should be the </w:t>
-      </w:r>
-      <w:r>
-        <w:rPr>
-          <w:b/>
-        </w:rPr>
-        <w:t>limiting component's whole-set count</w:t>
-      </w:r>
-      <w:r>
-        <w:t>, built on</w:t>
+        <w:t xml:space="preserve">    orders − In Repair = Available for Rent`, then *of which reserved for this order*,</w:t>
       </w:r>
     </w:p>
     <w:p>
       <w:r>
-        <w:t>the same (now repair-aware) component availability, with own-demand handled correctly.</w:t>
+        <w:t xml:space="preserve">    then *Located in: Input / QC / Stock*. "Total stock" is computed as</w:t>
+      </w:r>
+    </w:p>
+    <w:p>
+      <w:r>
+        <w:t xml:space="preserve">    `Available + Reserved(others) + In Repair` so it is warehouse-scoped and always</w:t>
+      </w:r>
+    </w:p>
+    <w:p>
+      <w:r>
+        <w:t xml:space="preserve">    reconciles exactly with the figure shown.</w:t>
       </w:r>
     </w:p>
     <w:p>
@@ -669,6 +672,119 @@
         <w:pStyle w:val="Heading1"/>
       </w:pPr>
       <w:r>
+        <w:t>1. Purpose &amp; Business Context</w:t>
+      </w:r>
+    </w:p>
+    <w:p>
+      <w:r>
+        <w:t xml:space="preserve">Rental staff need a </w:t>
+      </w:r>
+      <w:r>
+        <w:rPr>
+          <w:b/>
+        </w:rPr>
+        <w:t>trustworthy "available for this period" figure</w:t>
+      </w:r>
+      <w:r>
+        <w:t xml:space="preserve"> and a way to</w:t>
+      </w:r>
+    </w:p>
+    <w:p>
+      <w:r>
+        <w:rPr>
+          <w:b/>
+        </w:rPr>
+        <w:t>see where the stock actually is</w:t>
+      </w:r>
+      <w:r>
+        <w:t>. Two gaps cause wrong numbers and confusion:</w:t>
+      </w:r>
+    </w:p>
+    <w:p>
+      <w:r>
+        <w:t xml:space="preserve">1. </w:t>
+      </w:r>
+      <w:r>
+        <w:rPr>
+          <w:b/>
+        </w:rPr>
+        <w:t>Repairs are invisible to availability.</w:t>
+      </w:r>
+      <w:r>
+        <w:t xml:space="preserve"> A broken unit in an open repair order is</w:t>
+      </w:r>
+    </w:p>
+    <w:p>
+      <w:r>
+        <w:t xml:space="preserve">   physically present but </w:t>
+      </w:r>
+      <w:r>
+        <w:rPr>
+          <w:b/>
+        </w:rPr>
+        <w:t>not rentable</w:t>
+      </w:r>
+      <w:r>
+        <w:t xml:space="preserve"> — yet standard availability still counts it.</w:t>
+      </w:r>
+    </w:p>
+    <w:p>
+      <w:r>
+        <w:t xml:space="preserve">2. </w:t>
+      </w:r>
+      <w:r>
+        <w:rPr>
+          <w:b/>
+        </w:rPr>
+        <w:t>The figure is a single opaque number.</w:t>
+      </w:r>
+      <w:r>
+        <w:t xml:space="preserve"> Staff cannot see that (e.g.) of 10 units, 3</w:t>
+      </w:r>
+    </w:p>
+    <w:p>
+      <w:r>
+        <w:t xml:space="preserve">   are at a customer, 2 are in QC (not put away), 1 is in repair — so only 4 are pickable.</w:t>
+      </w:r>
+    </w:p>
+    <w:p>
+      <w:r>
+        <w:t xml:space="preserve">Separately, </w:t>
+      </w:r>
+      <w:r>
+        <w:rPr>
+          <w:b/>
+        </w:rPr>
+        <w:t>set availability</w:t>
+      </w:r>
+      <w:r>
+        <w:t xml:space="preserve"> (rental_set) uses custom own-demand/competing-demand</w:t>
+      </w:r>
+    </w:p>
+    <w:p>
+      <w:r>
+        <w:t xml:space="preserve">math that is fragile. It should be the </w:t>
+      </w:r>
+      <w:r>
+        <w:rPr>
+          <w:b/>
+        </w:rPr>
+        <w:t>limiting component's whole-set count</w:t>
+      </w:r>
+      <w:r>
+        <w:t>, built on</w:t>
+      </w:r>
+    </w:p>
+    <w:p>
+      <w:r>
+        <w:t>the same (now repair-aware) component availability, with own-demand handled correctly.</w:t>
+      </w:r>
+    </w:p>
+    <w:p>
+      <w:pPr>
+        <w:pStyle w:val="Heading1"/>
+      </w:pPr>
+      <w:r>
         <w:t>2. Background &amp; Root-Cause (verified in code)</w:t>
       </w:r>
     </w:p>
@@ -1694,21 +1810,21 @@
         <w:t>RAV-05</w:t>
       </w:r>
       <w:r>
-        <w:t xml:space="preserve"> Show, for the picking warehouse + period: per-internal-location on-hand</w:t>
+        <w:t xml:space="preserve"> Show, for the picking warehouse + period, an accounting flow:</w:t>
       </w:r>
     </w:p>
     <w:p>
       <w:r>
-        <w:t xml:space="preserve">  (Input / QC / Stock …), </w:t>
+        <w:t xml:space="preserve">  </w:t>
       </w:r>
       <w:r>
         <w:rPr>
           <w:b/>
         </w:rPr>
-        <w:t>Reserved by this order</w:t>
-      </w:r>
-      <w:r>
-        <w:t xml:space="preserve">, </w:t>
+        <w:t>Total stock</w:t>
+      </w:r>
+      <w:r>
+        <w:t xml:space="preserve"> − </w:t>
       </w:r>
       <w:r>
         <w:rPr>
@@ -1717,12 +1833,7 @@
         <w:t>Reserved by other orders</w:t>
       </w:r>
       <w:r>
-        <w:t>,</w:t>
-      </w:r>
-    </w:p>
-    <w:p>
-      <w:r>
-        <w:t xml:space="preserve">  </w:t>
+        <w:t xml:space="preserve"> − </w:t>
       </w:r>
       <w:r>
         <w:rPr>
@@ -1731,26 +1842,45 @@
         <w:t>In Repair</w:t>
       </w:r>
       <w:r>
-        <w:t xml:space="preserve"> (if repair installed), and net </w:t>
+        <w:t xml:space="preserve"> (if repair installed)</w:t>
+      </w:r>
+    </w:p>
+    <w:p>
+      <w:r>
+        <w:t xml:space="preserve">  = </w:t>
       </w:r>
       <w:r>
         <w:rPr>
           <w:b/>
         </w:rPr>
-        <w:t>Pickable / Available to this order</w:t>
-      </w:r>
-      <w:r>
-        <w:t>.</w:t>
+        <w:t>Available for Rent</w:t>
+      </w:r>
+      <w:r>
+        <w:t xml:space="preserve">; then </w:t>
+      </w:r>
+      <w:r>
+        <w:rPr>
+          <w:b/>
+        </w:rPr>
+        <w:t>of which reserved for this order</w:t>
+      </w:r>
+      <w:r>
+        <w:t>; then **Located</w:t>
       </w:r>
     </w:p>
     <w:p>
       <w:r>
-        <w:t xml:space="preserve">  No separate "At Customer" line — those units are already inside the reserved figures</w:t>
+        <w:t xml:space="preserve">  in**: per-internal-location on-hand (Input / QC / Stock …). No separate "At Customer"</w:t>
       </w:r>
     </w:p>
     <w:p>
       <w:r>
-        <w:t xml:space="preserve">  (§0.8).</w:t>
+        <w:t xml:space="preserve">  line — those units are already inside the reserved figures (§0.8). Available for Rent</w:t>
+      </w:r>
+    </w:p>
+    <w:p>
+      <w:r>
+        <w:t xml:space="preserve">  equals the native availability figure (§0.9).</w:t>
       </w:r>
     </w:p>
     <w:p>

</xml_diff>

<commit_message>
rental_set: full location partition at pickup (always sums to Total)
The pop-up location list is now a complete partition of Total stock at the
pickup instant: warehouse locations (Input/QC/Stock), At customer, In repair,
and a reconciling In transit/elsewhere bucket. It always sums back to Total,
so Total stays a stable anchor and never drifts as the pickup date shifts
(units are conserved). Per-location values are forecast to pickup =
current + incoming(<=pickup) - outgoing(<=pickup), so stock that clears QC
into Stock or returns from a customer by pickup shows in the right place.

New helpers _rental_stock_partition / _rental_forecast_by_location; widget
renders the partition with a '= Total stock' reconciliation row. T-08 now
asserts the partition sums to Total. Docs v6 (RAV-14). Suite 12/12 green.

Co-Authored-By: Claude Opus 4.8 <noreply@anthropic.com>
Claude-Session: https://claude.ai/code/session_015UyktmijNHjiCtQB359rzX
</commit_message>
<xml_diff>
--- a/docs/rental_availability_requirements.docx
+++ b/docs/rental_availability_requirements.docx
@@ -15,7 +15,7 @@
         <w:rPr>
           <w:i/>
         </w:rPr>
-        <w:t>Functional &amp; Technical Requirements, Goals &amp; Tests — Backend / Sales (Rental) + Inventory (v5, for approval)</w:t>
+        <w:t>Functional &amp; Technical Requirements, Goals &amp; Tests — Backend / Sales (Rental) + Inventory (v6, for approval)</w:t>
       </w:r>
     </w:p>
     <w:tbl>
@@ -668,116 +668,109 @@
       </w:r>
     </w:p>
     <w:p>
-      <w:pPr>
-        <w:pStyle w:val="Heading1"/>
-      </w:pPr>
-      <w:r>
-        <w:t>1. Purpose &amp; Business Context</w:t>
-      </w:r>
-    </w:p>
-    <w:p>
-      <w:r>
-        <w:t xml:space="preserve">Rental staff need a </w:t>
+      <w:r>
+        <w:t xml:space="preserve">11. </w:t>
       </w:r>
       <w:r>
         <w:rPr>
           <w:b/>
         </w:rPr>
-        <w:t>trustworthy "available for this period" figure</w:t>
-      </w:r>
-      <w:r>
-        <w:t xml:space="preserve"> and a way to</w:t>
+        <w:t>Location list is a FULL partition at pickup (v6).</w:t>
+      </w:r>
+      <w:r>
+        <w:t xml:space="preserve"> To keep "Total stock" a stable</w:t>
       </w:r>
     </w:p>
     <w:p>
+      <w:r>
+        <w:t xml:space="preserve">    anchor, the location list is a *complete* partition of Total at the </w:t>
+      </w:r>
       <w:r>
         <w:rPr>
           <w:b/>
         </w:rPr>
-        <w:t>see where the stock actually is</w:t>
-      </w:r>
-      <w:r>
-        <w:t>. Two gaps cause wrong numbers and confusion:</w:t>
+        <w:t>pickup instant</w:t>
       </w:r>
     </w:p>
     <w:p>
       <w:r>
-        <w:t xml:space="preserve">1. </w:t>
+        <w:t xml:space="preserve">    (reservation begin): warehouse internal locations (Input/QC/Stock…), </w:t>
       </w:r>
       <w:r>
         <w:rPr>
           <w:b/>
         </w:rPr>
-        <w:t>Repairs are invisible to availability.</w:t>
-      </w:r>
-      <w:r>
-        <w:t xml:space="preserve"> A broken unit in an open repair order is</w:t>
+        <w:t>At customer</w:t>
+      </w:r>
+      <w:r>
+        <w:t>,</w:t>
       </w:r>
     </w:p>
     <w:p>
       <w:r>
-        <w:t xml:space="preserve">   physically present but </w:t>
+        <w:t xml:space="preserve">    </w:t>
       </w:r>
       <w:r>
         <w:rPr>
           <w:b/>
         </w:rPr>
-        <w:t>not rentable</w:t>
-      </w:r>
-      <w:r>
-        <w:t xml:space="preserve"> — yet standard availability still counts it.</w:t>
-      </w:r>
-    </w:p>
-    <w:p>
-      <w:r>
-        <w:t xml:space="preserve">2. </w:t>
+        <w:t>In repair</w:t>
+      </w:r>
+      <w:r>
+        <w:t xml:space="preserve">, and a reconciling </w:t>
       </w:r>
       <w:r>
         <w:rPr>
           <w:b/>
         </w:rPr>
-        <w:t>The figure is a single opaque number.</w:t>
-      </w:r>
-      <w:r>
-        <w:t xml:space="preserve"> Staff cannot see that (e.g.) of 10 units, 3</w:t>
+        <w:t>In transit / elsewhere</w:t>
+      </w:r>
+      <w:r>
+        <w:t xml:space="preserve"> bucket. It therefore</w:t>
       </w:r>
     </w:p>
     <w:p>
       <w:r>
-        <w:t xml:space="preserve">   are at a customer, 2 are in QC (not put away), 1 is in repair — so only 4 are pickable.</w:t>
-      </w:r>
-    </w:p>
-    <w:p>
-      <w:r>
-        <w:t xml:space="preserve">Separately, </w:t>
+        <w:t xml:space="preserve">    </w:t>
       </w:r>
       <w:r>
         <w:rPr>
           <w:b/>
         </w:rPr>
-        <w:t>set availability</w:t>
-      </w:r>
-      <w:r>
-        <w:t xml:space="preserve"> (rental_set) uses custom own-demand/competing-demand</w:t>
+        <w:t>always sums to Total</w:t>
+      </w:r>
+      <w:r>
+        <w:t xml:space="preserve"> — the pickup date only shifts the *distribution*, never the</w:t>
       </w:r>
     </w:p>
     <w:p>
       <w:r>
-        <w:t xml:space="preserve">math that is fragile. It should be the </w:t>
-      </w:r>
-      <w:r>
-        <w:rPr>
-          <w:b/>
-        </w:rPr>
-        <w:t>limiting component's whole-set count</w:t>
-      </w:r>
-      <w:r>
-        <w:t>, built on</w:t>
+        <w:t xml:space="preserve">    total (units are conserved: they move, they don't appear/vanish). This is a</w:t>
       </w:r>
     </w:p>
     <w:p>
       <w:r>
-        <w:t>the same (now repair-aware) component availability, with own-demand handled correctly.</w:t>
+        <w:t xml:space="preserve">    *physical-presence* lens (a unit can be physically at Stock yet reserved by another</w:t>
+      </w:r>
+    </w:p>
+    <w:p>
+      <w:r>
+        <w:t xml:space="preserve">    order), distinct from the availability math above it; both anchor to the same Total.</w:t>
+      </w:r>
+    </w:p>
+    <w:p>
+      <w:r>
+        <w:t xml:space="preserve">    Per-location values are forecast to pickup = current on-hand + incoming(≤pickup) −</w:t>
+      </w:r>
+    </w:p>
+    <w:p>
+      <w:r>
+        <w:t xml:space="preserve">    outgoing(≤pickup), so units that will have cleared QC into Stock (or returned from a</w:t>
+      </w:r>
+    </w:p>
+    <w:p>
+      <w:r>
+        <w:t xml:space="preserve">    customer) by pickup show in the right place.</w:t>
       </w:r>
     </w:p>
     <w:p>
@@ -785,6 +778,119 @@
         <w:pStyle w:val="Heading1"/>
       </w:pPr>
       <w:r>
+        <w:t>1. Purpose &amp; Business Context</w:t>
+      </w:r>
+    </w:p>
+    <w:p>
+      <w:r>
+        <w:t xml:space="preserve">Rental staff need a </w:t>
+      </w:r>
+      <w:r>
+        <w:rPr>
+          <w:b/>
+        </w:rPr>
+        <w:t>trustworthy "available for this period" figure</w:t>
+      </w:r>
+      <w:r>
+        <w:t xml:space="preserve"> and a way to</w:t>
+      </w:r>
+    </w:p>
+    <w:p>
+      <w:r>
+        <w:rPr>
+          <w:b/>
+        </w:rPr>
+        <w:t>see where the stock actually is</w:t>
+      </w:r>
+      <w:r>
+        <w:t>. Two gaps cause wrong numbers and confusion:</w:t>
+      </w:r>
+    </w:p>
+    <w:p>
+      <w:r>
+        <w:t xml:space="preserve">1. </w:t>
+      </w:r>
+      <w:r>
+        <w:rPr>
+          <w:b/>
+        </w:rPr>
+        <w:t>Repairs are invisible to availability.</w:t>
+      </w:r>
+      <w:r>
+        <w:t xml:space="preserve"> A broken unit in an open repair order is</w:t>
+      </w:r>
+    </w:p>
+    <w:p>
+      <w:r>
+        <w:t xml:space="preserve">   physically present but </w:t>
+      </w:r>
+      <w:r>
+        <w:rPr>
+          <w:b/>
+        </w:rPr>
+        <w:t>not rentable</w:t>
+      </w:r>
+      <w:r>
+        <w:t xml:space="preserve"> — yet standard availability still counts it.</w:t>
+      </w:r>
+    </w:p>
+    <w:p>
+      <w:r>
+        <w:t xml:space="preserve">2. </w:t>
+      </w:r>
+      <w:r>
+        <w:rPr>
+          <w:b/>
+        </w:rPr>
+        <w:t>The figure is a single opaque number.</w:t>
+      </w:r>
+      <w:r>
+        <w:t xml:space="preserve"> Staff cannot see that (e.g.) of 10 units, 3</w:t>
+      </w:r>
+    </w:p>
+    <w:p>
+      <w:r>
+        <w:t xml:space="preserve">   are at a customer, 2 are in QC (not put away), 1 is in repair — so only 4 are pickable.</w:t>
+      </w:r>
+    </w:p>
+    <w:p>
+      <w:r>
+        <w:t xml:space="preserve">Separately, </w:t>
+      </w:r>
+      <w:r>
+        <w:rPr>
+          <w:b/>
+        </w:rPr>
+        <w:t>set availability</w:t>
+      </w:r>
+      <w:r>
+        <w:t xml:space="preserve"> (rental_set) uses custom own-demand/competing-demand</w:t>
+      </w:r>
+    </w:p>
+    <w:p>
+      <w:r>
+        <w:t xml:space="preserve">math that is fragile. It should be the </w:t>
+      </w:r>
+      <w:r>
+        <w:rPr>
+          <w:b/>
+        </w:rPr>
+        <w:t>limiting component's whole-set count</w:t>
+      </w:r>
+      <w:r>
+        <w:t>, built on</w:t>
+      </w:r>
+    </w:p>
+    <w:p>
+      <w:r>
+        <w:t>the same (now repair-aware) component availability, with own-demand handled correctly.</w:t>
+      </w:r>
+    </w:p>
+    <w:p>
+      <w:pPr>
+        <w:pStyle w:val="Heading1"/>
+      </w:pPr>
+      <w:r>
         <w:t>2. Background &amp; Root-Cause (verified in code)</w:t>
       </w:r>
     </w:p>
@@ -1865,22 +1971,82 @@
         <w:t>of which reserved for this order</w:t>
       </w:r>
       <w:r>
-        <w:t>; then **Located</w:t>
+        <w:t>. Available for Rent</w:t>
       </w:r>
     </w:p>
     <w:p>
       <w:r>
-        <w:t xml:space="preserve">  in**: per-internal-location on-hand (Input / QC / Stock …). No separate "At Customer"</w:t>
+        <w:t xml:space="preserve">  equals the native availability figure (§0.9). No "At Customer" line in this</w:t>
       </w:r>
     </w:p>
     <w:p>
       <w:r>
-        <w:t xml:space="preserve">  line — those units are already inside the reserved figures (§0.8). Available for Rent</w:t>
+        <w:t xml:space="preserve">  *availability* section — those units are already inside the reserved figures (§0.8).</w:t>
       </w:r>
     </w:p>
     <w:p>
-      <w:r>
-        <w:t xml:space="preserve">  equals the native availability figure (§0.9).</w:t>
+      <w:pPr>
+        <w:pStyle w:val="ListBullet"/>
+      </w:pPr>
+      <w:r>
+        <w:rPr>
+          <w:b/>
+        </w:rPr>
+        <w:t>RAV-14</w:t>
+      </w:r>
+      <w:r>
+        <w:t xml:space="preserve"> Below it, a </w:t>
+      </w:r>
+      <w:r>
+        <w:rPr>
+          <w:b/>
+        </w:rPr>
+        <w:t>full physical partition at pickup</w:t>
+      </w:r>
+      <w:r>
+        <w:t xml:space="preserve"> that always sums to Total:</w:t>
+      </w:r>
+    </w:p>
+    <w:p>
+      <w:r>
+        <w:t xml:space="preserve">  warehouse locations (Input/QC/Stock…), </w:t>
+      </w:r>
+      <w:r>
+        <w:rPr>
+          <w:b/>
+        </w:rPr>
+        <w:t>At customer</w:t>
+      </w:r>
+      <w:r>
+        <w:t xml:space="preserve">, </w:t>
+      </w:r>
+      <w:r>
+        <w:rPr>
+          <w:b/>
+        </w:rPr>
+        <w:t>In repair</w:t>
+      </w:r>
+      <w:r>
+        <w:t>, and a</w:t>
+      </w:r>
+    </w:p>
+    <w:p>
+      <w:r>
+        <w:t xml:space="preserve">  reconciling </w:t>
+      </w:r>
+      <w:r>
+        <w:rPr>
+          <w:b/>
+        </w:rPr>
+        <w:t>In transit / elsewhere</w:t>
+      </w:r>
+      <w:r>
+        <w:t xml:space="preserve"> bucket (§0.11). Per-location values are forecast</w:t>
+      </w:r>
+    </w:p>
+    <w:p>
+      <w:r>
+        <w:t xml:space="preserve">  to the pickup instant. This keeps Total a stable anchor and never "drifts".</w:t>
       </w:r>
     </w:p>
     <w:p>

</xml_diff>

<commit_message>
rental_set: location partition uses current on-hand (fix phantom -1 bucket)
The pop-up per-location list was forecasting to pickup by applying pending
moves, which blindly applied internal staging/pick moves (Stock->Packing
Zone) and partial reservations -> phantom 'Packing Zone 8' and negative
'In transit -1' on real order S01532 (7 units, all in Stock). Switch to
CURRENT physical on-hand per location: robust, always >=0, sums to Total.
Now S01532 shows 'PRO/Stock 7 = Total 7'. Period-awareness stays in
'Available for Rent'. Docs v7. Suite 12/12 green.

Co-Authored-By: Claude Opus 4.8 <noreply@anthropic.com>
Claude-Session: https://claude.ai/code/session_015UyktmijNHjiCtQB359rzX
</commit_message>
<xml_diff>
--- a/docs/rental_availability_requirements.docx
+++ b/docs/rental_availability_requirements.docx
@@ -15,7 +15,7 @@
         <w:rPr>
           <w:i/>
         </w:rPr>
-        <w:t>Functional &amp; Technical Requirements, Goals &amp; Tests — Backend / Sales (Rental) + Inventory (v6, for approval)</w:t>
+        <w:t>Functional &amp; Technical Requirements, Goals &amp; Tests — Backend / Sales (Rental) + Inventory (v7, for approval)</w:t>
       </w:r>
     </w:p>
     <w:tbl>
@@ -675,26 +675,20 @@
         <w:rPr>
           <w:b/>
         </w:rPr>
-        <w:t>Location list is a FULL partition at pickup (v6).</w:t>
-      </w:r>
-      <w:r>
-        <w:t xml:space="preserve"> To keep "Total stock" a stable</w:t>
+        <w:t>Location list = CURRENT on-hand per location, summing to Total (v6→v7).</w:t>
+      </w:r>
+      <w:r>
+        <w:t xml:space="preserve"> To keep</w:t>
       </w:r>
     </w:p>
     <w:p>
       <w:r>
-        <w:t xml:space="preserve">    anchor, the location list is a *complete* partition of Total at the </w:t>
-      </w:r>
-      <w:r>
-        <w:rPr>
-          <w:b/>
-        </w:rPr>
-        <w:t>pickup instant</w:t>
+        <w:t xml:space="preserve">    "Total stock" a stable anchor, the location list partitions Total across physical</w:t>
       </w:r>
     </w:p>
     <w:p>
       <w:r>
-        <w:t xml:space="preserve">    (reservation begin): warehouse internal locations (Input/QC/Stock…), </w:t>
+        <w:t xml:space="preserve">    buckets: warehouse internal locations (Input/QC/Stock…), </w:t>
       </w:r>
       <w:r>
         <w:rPr>
@@ -703,74 +697,79 @@
         <w:t>At customer</w:t>
       </w:r>
       <w:r>
-        <w:t>,</w:t>
+        <w:t>, **In</w:t>
       </w:r>
     </w:p>
     <w:p>
       <w:r>
-        <w:t xml:space="preserve">    </w:t>
+        <w:t xml:space="preserve">    repair</w:t>
       </w:r>
       <w:r>
         <w:rPr>
           <w:b/>
         </w:rPr>
-        <w:t>In repair</w:t>
-      </w:r>
-      <w:r>
-        <w:t xml:space="preserve">, and a reconciling </w:t>
+        <w:t xml:space="preserve">, and a small reconciling </w:t>
+      </w:r>
+      <w:r>
+        <w:t>Other / in transit</w:t>
       </w:r>
       <w:r>
         <w:rPr>
           <w:b/>
         </w:rPr>
-        <w:t>In transit / elsewhere</w:t>
-      </w:r>
-      <w:r>
-        <w:t xml:space="preserve"> bucket. It therefore</w:t>
+        <w:t xml:space="preserve"> bucket. It uses </w:t>
+      </w:r>
+      <w:r>
+        <w:t>current</w:t>
       </w:r>
     </w:p>
     <w:p>
       <w:r>
-        <w:t xml:space="preserve">    </w:t>
+        <w:t xml:space="preserve">    physical quants</w:t>
       </w:r>
       <w:r>
         <w:rPr>
           <w:b/>
         </w:rPr>
-        <w:t>always sums to Total</w:t>
-      </w:r>
-      <w:r>
-        <w:t xml:space="preserve"> — the pickup date only shifts the *distribution*, never the</w:t>
+        <w:t xml:space="preserve"> (always ≥ 0) — deliberately </w:t>
+      </w:r>
+      <w:r>
+        <w:t>not** a per-location forecast to</w:t>
       </w:r>
     </w:p>
     <w:p>
       <w:r>
-        <w:t xml:space="preserve">    total (units are conserved: they move, they don't appear/vanish). This is a</w:t>
+        <w:t xml:space="preserve">    pickup. Rationale (v7): forecasting per location blindly applied pending internal</w:t>
       </w:r>
     </w:p>
     <w:p>
       <w:r>
-        <w:t xml:space="preserve">    *physical-presence* lens (a unit can be physically at Stock yet reserved by another</w:t>
+        <w:t xml:space="preserve">    staging/pick moves (Stock→Packing Zone) and partial reservations, producing a</w:t>
       </w:r>
     </w:p>
     <w:p>
       <w:r>
-        <w:t xml:space="preserve">    order), distinct from the availability math above it; both anchor to the same Total.</w:t>
+        <w:t xml:space="preserve">    phantom "Packing Zone 8" and a negative "In transit −1" on a real order (S01532,</w:t>
       </w:r>
     </w:p>
     <w:p>
       <w:r>
-        <w:t xml:space="preserve">    Per-location values are forecast to pickup = current on-hand + incoming(≤pickup) −</w:t>
+        <w:t xml:space="preserve">    only 7 units, both in Stock). Current on-hand is robust and honest; period-awareness</w:t>
       </w:r>
     </w:p>
     <w:p>
       <w:r>
-        <w:t xml:space="preserve">    outgoing(≤pickup), so units that will have cleared QC into Stock (or returned from a</w:t>
+        <w:t xml:space="preserve">    stays in "Available for Rent". This is a *physical-presence* lens (a unit can sit at</w:t>
       </w:r>
     </w:p>
     <w:p>
       <w:r>
-        <w:t xml:space="preserve">    customer) by pickup show in the right place.</w:t>
+        <w:t xml:space="preserve">    Stock yet be reserved by another order), distinct from the availability math; both</w:t>
+      </w:r>
+    </w:p>
+    <w:p>
+      <w:r>
+        <w:t xml:space="preserve">    anchor to the same Total.</w:t>
       </w:r>
     </w:p>
     <w:p>
@@ -2001,10 +2000,10 @@
         <w:rPr>
           <w:b/>
         </w:rPr>
-        <w:t>full physical partition at pickup</w:t>
-      </w:r>
-      <w:r>
-        <w:t xml:space="preserve"> that always sums to Total:</w:t>
+        <w:t>physical partition by current on-hand</w:t>
+      </w:r>
+      <w:r>
+        <w:t xml:space="preserve"> that sums to Total:</w:t>
       </w:r>
     </w:p>
     <w:p>
@@ -2027,7 +2026,7 @@
         <w:t>In repair</w:t>
       </w:r>
       <w:r>
-        <w:t>, and a</w:t>
+        <w:t>, and a small</w:t>
       </w:r>
     </w:p>
     <w:p>
@@ -2038,15 +2037,20 @@
         <w:rPr>
           <w:b/>
         </w:rPr>
-        <w:t>In transit / elsewhere</w:t>
-      </w:r>
-      <w:r>
-        <w:t xml:space="preserve"> bucket (§0.11). Per-location values are forecast</w:t>
+        <w:t>Other / in transit</w:t>
+      </w:r>
+      <w:r>
+        <w:t xml:space="preserve"> bucket (§0.11). Uses current quants (robust, ≥ 0) —</w:t>
       </w:r>
     </w:p>
     <w:p>
       <w:r>
-        <w:t xml:space="preserve">  to the pickup instant. This keeps Total a stable anchor and never "drifts".</w:t>
+        <w:t xml:space="preserve">  not a per-location pickup forecast (which produced phantom/negative buckets). Keeps</w:t>
+      </w:r>
+    </w:p>
+    <w:p>
+      <w:r>
+        <w:t xml:space="preserve">  Total a stable anchor; period-awareness lives in "Available for Rent".</w:t>
       </w:r>
     </w:p>
     <w:p>

</xml_diff>

<commit_message>
rental_set: Option A pop-up — two lenses (physical Total vs time-based availability)
Total stock is now the REAL physical count (current on-hand across the
warehouse internal locations + the internal rental/at-customer location),
not derived from the forecast. It is conserved and stable, so picking a unit
just moves it Stock->At customer with Total unchanged — fixing the 'Total
increased by the amount picked' phantom (verified on S01549: Total 7, Packing
4 + Stock 3, no 'Other/in transit'). Pop-up split into two sections that do
not net to each other: 'For this rental' (Reserved by others / Available to
this order / of which yours / Requested / Missing) and 'Physical stock (right
now)' (Total + location partition). T-08 updated to the physical-Total
semantics. Docs v8. Suite 12/12 green.

Co-Authored-By: Claude Opus 4.8 <noreply@anthropic.com>
Claude-Session: https://claude.ai/code/session_015UyktmijNHjiCtQB359rzX
</commit_message>
<xml_diff>
--- a/docs/rental_availability_requirements.docx
+++ b/docs/rental_availability_requirements.docx
@@ -15,7 +15,7 @@
         <w:rPr>
           <w:i/>
         </w:rPr>
-        <w:t>Functional &amp; Technical Requirements, Goals &amp; Tests — Backend / Sales (Rental) + Inventory (v7, for approval)</w:t>
+        <w:t>Functional &amp; Technical Requirements, Goals &amp; Tests — Backend / Sales (Rental) + Inventory (v8, for approval)</w:t>
       </w:r>
     </w:p>
     <w:tbl>
@@ -770,6 +770,139 @@
     <w:p>
       <w:r>
         <w:t xml:space="preserve">    anchor to the same Total.</w:t>
+      </w:r>
+    </w:p>
+    <w:p>
+      <w:r>
+        <w:t xml:space="preserve">12. </w:t>
+      </w:r>
+      <w:r>
+        <w:rPr>
+          <w:b/>
+        </w:rPr>
+        <w:t>Option A implemented — two independent lenses (v8).</w:t>
+      </w:r>
+      <w:r>
+        <w:t xml:space="preserve"> The single accounting flow</w:t>
+      </w:r>
+    </w:p>
+    <w:p>
+      <w:r>
+        <w:t xml:space="preserve">    (`Total − Reserved − Repair = Available`) is dropped. A rental line's pop-up now has</w:t>
+      </w:r>
+    </w:p>
+    <w:p>
+      <w:r>
+        <w:t xml:space="preserve">    two sections that do </w:t>
+      </w:r>
+      <w:r>
+        <w:rPr>
+          <w:b/>
+        </w:rPr>
+        <w:t>not</w:t>
+      </w:r>
+      <w:r>
+        <w:t xml:space="preserve"> net to each other:</w:t>
+      </w:r>
+    </w:p>
+    <w:p>
+      <w:pPr>
+        <w:pStyle w:val="ListBullet"/>
+      </w:pPr>
+      <w:r>
+        <w:rPr>
+          <w:b/>
+        </w:rPr>
+        <w:t>For this rental</w:t>
+      </w:r>
+      <w:r>
+        <w:t xml:space="preserve"> (time-based): Reserved by other orders, Available to this order</w:t>
+      </w:r>
+    </w:p>
+    <w:p>
+      <w:r>
+        <w:t xml:space="preserve">      (of which reserved for this order), Requested by this order, Missing for this order.</w:t>
+      </w:r>
+    </w:p>
+    <w:p>
+      <w:pPr>
+        <w:pStyle w:val="ListBullet"/>
+      </w:pPr>
+      <w:r>
+        <w:rPr>
+          <w:b/>
+        </w:rPr>
+        <w:t>Physical stock (right now)</w:t>
+      </w:r>
+      <w:r>
+        <w:t xml:space="preserve"> (point-in-time): </w:t>
+      </w:r>
+      <w:r>
+        <w:rPr>
+          <w:b/>
+        </w:rPr>
+        <w:t>Total stock</w:t>
+      </w:r>
+      <w:r>
+        <w:t xml:space="preserve"> = real units owned =</w:t>
+      </w:r>
+    </w:p>
+    <w:p>
+      <w:r>
+        <w:t xml:space="preserve">      current on-hand across the warehouse's internal locations </w:t>
+      </w:r>
+      <w:r>
+        <w:rPr>
+          <w:b/>
+        </w:rPr>
+        <w:t>plus</w:t>
+      </w:r>
+      <w:r>
+        <w:t xml:space="preserve"> the internal</w:t>
+      </w:r>
+    </w:p>
+    <w:p>
+      <w:r>
+        <w:t xml:space="preserve">      rental (at customer) location; then the per-location partition (which sums to</w:t>
+      </w:r>
+    </w:p>
+    <w:p>
+      <w:r>
+        <w:t xml:space="preserve">      Total). Total is </w:t>
+      </w:r>
+      <w:r>
+        <w:rPr>
+          <w:b/>
+        </w:rPr>
+        <w:t>conserved and stable</w:t>
+      </w:r>
+      <w:r>
+        <w:t xml:space="preserve"> — picking a unit just moves it from Stock</w:t>
+      </w:r>
+    </w:p>
+    <w:p>
+      <w:r>
+        <w:t xml:space="preserve">      to "At customer", Total unchanged. This kills the earlier "Total jumped by the</w:t>
+      </w:r>
+    </w:p>
+    <w:p>
+      <w:r>
+        <w:t xml:space="preserve">      amount picked" artifact (the old Total was back-derived from the forecast, which</w:t>
+      </w:r>
+    </w:p>
+    <w:p>
+      <w:r>
+        <w:t xml:space="preserve">      credits scheduled returns). Consequence (accepted): "Available to this order" can</w:t>
+      </w:r>
+    </w:p>
+    <w:p>
+      <w:r>
+        <w:t xml:space="preserve">      exceed physically-free stock when units return within the window — correct, and</w:t>
+      </w:r>
+    </w:p>
+    <w:p>
+      <w:r>
+        <w:t xml:space="preserve">      why the two lenses are shown separately.</w:t>
       </w:r>
     </w:p>
     <w:p>

</xml_diff>

<commit_message>
rental_set: fix availability — Total physical - Reserved(others) - Repair
Replace the old move-walk / own-demand add-back forecast (which excluded DONE
pickup moves, so a picked order lost its add-back and looked short while an
un-picked competitor looked fully available). New symmetric formula:
Available to this order = max(physical Total - reserved by other orders
(period-aware, excl. this line) - in repair, 0). Own demand is never
subtracted from itself. Same formula for set components. Verified on real
orders S01532/S01549 (both now Available 3 / Missing 1 instead of the
inverted 3-red / 7-green). Suite 51/51 + T-14 competing-orders. Docs v9.

Co-Authored-By: Claude Opus 4.8 <noreply@anthropic.com>
Claude-Session: https://claude.ai/code/session_015UyktmijNHjiCtQB359rzX
</commit_message>
<xml_diff>
--- a/docs/rental_availability_requirements.docx
+++ b/docs/rental_availability_requirements.docx
@@ -15,7 +15,7 @@
         <w:rPr>
           <w:i/>
         </w:rPr>
-        <w:t>Functional &amp; Technical Requirements, Goals &amp; Tests — Backend / Sales (Rental) + Inventory (v8, for approval)</w:t>
+        <w:t>Functional &amp; Technical Requirements, Goals &amp; Tests — Backend / Sales (Rental) + Inventory (v9, for approval)</w:t>
       </w:r>
     </w:p>
     <w:tbl>
@@ -903,6 +903,98 @@
     <w:p>
       <w:r>
         <w:t xml:space="preserve">      why the two lenses are shown separately.</w:t>
+      </w:r>
+    </w:p>
+    <w:p>
+      <w:r>
+        <w:t xml:space="preserve">13. </w:t>
+      </w:r>
+      <w:r>
+        <w:rPr>
+          <w:b/>
+        </w:rPr>
+        <w:t>Availability formula replaced (v9).</w:t>
+      </w:r>
+      <w:r>
+        <w:t xml:space="preserve"> "Available to this order" no longer uses the</w:t>
+      </w:r>
+    </w:p>
+    <w:p>
+      <w:r>
+        <w:t xml:space="preserve">    old move-walk / own-demand add-back. It is now:</w:t>
+      </w:r>
+    </w:p>
+    <w:p>
+      <w:r>
+        <w:t xml:space="preserve">    `Available = max(Total physical stock − Reserved by other orders − In Repair, 0)`,</w:t>
+      </w:r>
+    </w:p>
+    <w:p>
+      <w:r>
+        <w:t xml:space="preserve">    where *Reserved by other orders* is the native period-aware peak-concurrent demand of</w:t>
+      </w:r>
+    </w:p>
+    <w:p>
+      <w:r>
+        <w:t xml:space="preserve">    </w:t>
+      </w:r>
+      <w:r>
+        <w:rPr>
+          <w:b/>
+        </w:rPr>
+        <w:t>other</w:t>
+      </w:r>
+      <w:r>
+        <w:t xml:space="preserve"> confirmed rentals (excludes this line). Reason: the old code excluded</w:t>
+      </w:r>
+    </w:p>
+    <w:p>
+      <w:r>
+        <w:t xml:space="preserve">    </w:t>
+      </w:r>
+      <w:r>
+        <w:rPr>
+          <w:b/>
+        </w:rPr>
+        <w:t>done</w:t>
+      </w:r>
+      <w:r>
+        <w:t xml:space="preserve"> pickup moves, so once an order was (partially) picked it lost its own-demand</w:t>
+      </w:r>
+    </w:p>
+    <w:p>
+      <w:r>
+        <w:t xml:space="preserve">    add-back and looked *short*, while an un-picked competitor looked *fully available* —</w:t>
+      </w:r>
+    </w:p>
+    <w:p>
+      <w:r>
+        <w:t xml:space="preserve">    the shortfall landed on the wrong order (real case: two orders wanting 4 from 7 →</w:t>
+      </w:r>
+    </w:p>
+    <w:p>
+      <w:r>
+        <w:t xml:space="preserve">    picked S01532 showed Missing 1 while un-picked S01549 wrongly showed Missing 0). The</w:t>
+      </w:r>
+    </w:p>
+    <w:p>
+      <w:r>
+        <w:t xml:space="preserve">    new formula is symmetric and correct: both competing orders show Available 3 / Missing</w:t>
+      </w:r>
+    </w:p>
+    <w:p>
+      <w:r>
+        <w:t xml:space="preserve">    1 (honest — 8 demanded from 7), own demand is never subtracted from itself (it's not</w:t>
+      </w:r>
+    </w:p>
+    <w:p>
+      <w:r>
+        <w:t xml:space="preserve">    an "other order"), and it no longer depends on pick/delivery state. Same formula is</w:t>
+      </w:r>
+    </w:p>
+    <w:p>
+      <w:r>
+        <w:t xml:space="preserve">    used for set components. (Tested: T-14 competing orders.)</w:t>
       </w:r>
     </w:p>
     <w:p>

</xml_diff>